<commit_message>
Updated Chapter 1 Master
</commit_message>
<xml_diff>
--- a/01_THESIS/Chapter 1/Chapter 1 Master.docx
+++ b/01_THESIS/Chapter 1/Chapter 1 Master.docx
@@ -7,14 +7,2000 @@
         <w:spacing w:line="480" w:lineRule="auto"/>
         <w:jc w:val="center"/>
         <w:rPr>
-          <w:rFonts w:ascii="Times New Roman" w:hAnsi="Times New Roman" w:cs="Times New Roman"/>
+          <w:b/>
+          <w:bCs/>
+          <w:sz w:val="24"/>
+          <w:szCs w:val="24"/>
+        </w:rPr>
+      </w:pPr>
+      <w:proofErr w:type="spellStart"/>
+      <w:r>
+        <w:rPr>
+          <w:b/>
+          <w:bCs/>
+          <w:sz w:val="24"/>
+          <w:szCs w:val="24"/>
+        </w:rPr>
+        <w:t>ACTSight</w:t>
+      </w:r>
+      <w:proofErr w:type="spellEnd"/>
+      <w:r>
+        <w:rPr>
+          <w:b/>
+          <w:bCs/>
+          <w:sz w:val="24"/>
+          <w:szCs w:val="24"/>
+        </w:rPr>
+        <w:t>: An OCR-Based Automated Assessment and Agentic Console for Quiz Automation, AI-Assisted Learning Plan Generation, and Student Retention Analytics</w:t>
+      </w:r>
+    </w:p>
+    <w:p>
+      <w:pPr>
+        <w:spacing w:after="160" w:line="259" w:lineRule="auto"/>
+        <w:rPr>
+          <w:b/>
+          <w:bCs/>
+          <w:sz w:val="24"/>
+          <w:szCs w:val="24"/>
+        </w:rPr>
+      </w:pPr>
+      <w:r>
+        <w:rPr>
+          <w:b/>
+          <w:bCs/>
+          <w:sz w:val="24"/>
+          <w:szCs w:val="24"/>
+        </w:rPr>
+        <w:br w:type="page"/>
+      </w:r>
+    </w:p>
+    <w:p>
+      <w:pPr>
+        <w:spacing w:line="480" w:lineRule="auto"/>
+        <w:jc w:val="center"/>
+      </w:pPr>
+      <w:r>
+        <w:rPr>
+          <w:b/>
+          <w:bCs/>
+          <w:sz w:val="24"/>
+          <w:szCs w:val="24"/>
+        </w:rPr>
+        <w:lastRenderedPageBreak/>
+        <w:t>CHAPTER 1</w:t>
+      </w:r>
+    </w:p>
+    <w:p>
+      <w:pPr>
+        <w:spacing w:line="480" w:lineRule="auto"/>
+        <w:jc w:val="center"/>
+      </w:pPr>
+      <w:r>
+        <w:rPr>
+          <w:b/>
+          <w:bCs/>
+          <w:sz w:val="24"/>
+          <w:szCs w:val="24"/>
+        </w:rPr>
+        <w:t>INTRODUCTION</w:t>
+      </w:r>
+    </w:p>
+    <w:p>
+      <w:pPr>
+        <w:spacing w:line="480" w:lineRule="auto"/>
+        <w:ind w:firstLine="720"/>
+        <w:jc w:val="both"/>
+      </w:pPr>
+      <w:r>
+        <w:rPr>
+          <w:sz w:val="24"/>
+          <w:szCs w:val="24"/>
+        </w:rPr>
+        <w:t>Assessment remains one of the most essential components of the teaching and learning process. It allows teachers to determine whether learning objectives have been met and to identify students who may need further support, while giving students the opportunity to demonstrate what they have learned. Assessments are generally classified into two broad types. Objective assessments, such as multiple-choice and true-or-false questions, ask students to select an answer from a fixed set of choices and can be checked by comparing the response against a predetermined answer key. Constructed-response assessments, such as short-answer items and essays, instead require students to produce their own explanations or arguments, making them useful for measuring higher-order skills such as comprehension, analysis, and written communication (Susanti et al., 2023).</w:t>
+      </w:r>
+    </w:p>
+    <w:p>
+      <w:pPr>
+        <w:spacing w:line="480" w:lineRule="auto"/>
+        <w:ind w:firstLine="720"/>
+        <w:jc w:val="both"/>
+      </w:pPr>
+      <w:r>
+        <w:rPr>
+          <w:sz w:val="24"/>
+          <w:szCs w:val="24"/>
+        </w:rPr>
+        <w:t xml:space="preserve">Despite their different formats, both kinds of assessment place considerable demands on a teacher's time, particularly in schools that still rely heavily on paper-based testing. Objective items must be checked against an answer key and tallied into scores, essays and short-answer items must be read and judged individually against a rubric, and results must eventually be consolidated to compute grades. In classes with several sections and large </w:t>
+      </w:r>
+      <w:proofErr w:type="spellStart"/>
+      <w:r>
+        <w:rPr>
+          <w:sz w:val="24"/>
+          <w:szCs w:val="24"/>
+        </w:rPr>
+        <w:t>enrollments</w:t>
+      </w:r>
+      <w:proofErr w:type="spellEnd"/>
+      <w:r>
+        <w:rPr>
+          <w:sz w:val="24"/>
+          <w:szCs w:val="24"/>
+        </w:rPr>
+        <w:t xml:space="preserve">, a teacher may need to process hundreds of papers across multiple assessment periods, a task made more difficult by the physical handling, encoding, and computation involved (Ramesh &amp; </w:t>
+      </w:r>
+      <w:proofErr w:type="spellStart"/>
+      <w:r>
+        <w:rPr>
+          <w:sz w:val="24"/>
+          <w:szCs w:val="24"/>
+        </w:rPr>
+        <w:t>Sanampudi</w:t>
+      </w:r>
+      <w:proofErr w:type="spellEnd"/>
+      <w:r>
+        <w:rPr>
+          <w:sz w:val="24"/>
+          <w:szCs w:val="24"/>
+        </w:rPr>
+        <w:t>, 2022). Beyond the checking process itself, teachers must also extract identifying details, such as a student's name or reference number, from each submitted paper before scores can be properly recorded.</w:t>
+      </w:r>
+    </w:p>
+    <w:p>
+      <w:pPr>
+        <w:spacing w:line="480" w:lineRule="auto"/>
+        <w:ind w:firstLine="720"/>
+        <w:jc w:val="both"/>
+      </w:pPr>
+      <w:r>
+        <w:rPr>
+          <w:sz w:val="24"/>
+          <w:szCs w:val="24"/>
+        </w:rPr>
+        <w:lastRenderedPageBreak/>
+        <w:t>To reduce the manual effort involved in checking paper-based objective assessments, schools and researchers have explored the use of Optical Character Recognition (OCR) and Optical Mark Recognition (OMR) technologies. OMR allows a system to detect shaded or marked responses on a structured answer sheet and compare them against an answer key, while OCR allows text such as a student's name to be extracted directly from a scanned or photographed image. Recent implementations built around widely available computer vision libraries have shown that such tools can automate the grading of objective, paper-based tests with considerably less manual effort than traditional checking methods (Rajagopal &amp; Saha, 2024). These approaches, however, are primarily suited to objective items and do not address the more complex task of checking constructed responses.</w:t>
+      </w:r>
+    </w:p>
+    <w:p>
+      <w:pPr>
+        <w:spacing w:line="480" w:lineRule="auto"/>
+        <w:ind w:firstLine="720"/>
+        <w:jc w:val="both"/>
+      </w:pPr>
+      <w:r>
+        <w:rPr>
+          <w:sz w:val="24"/>
+          <w:szCs w:val="24"/>
+        </w:rPr>
+        <w:t xml:space="preserve">For essay and short-answer questions, approaches collectively referred to as Automated Essay Scoring (AES) apply Natural Language Processing (NLP) and machine learning techniques to evaluate written responses and generate a predicted score based on patterns learned from previously scored examples. Systematic reviews of AES research show that the field has grown from early statistical methods into more advanced approaches capable of </w:t>
+      </w:r>
+      <w:proofErr w:type="spellStart"/>
+      <w:r>
+        <w:rPr>
+          <w:sz w:val="24"/>
+          <w:szCs w:val="24"/>
+        </w:rPr>
+        <w:t>analyzing</w:t>
+      </w:r>
+      <w:proofErr w:type="spellEnd"/>
+      <w:r>
+        <w:rPr>
+          <w:sz w:val="24"/>
+          <w:szCs w:val="24"/>
+        </w:rPr>
+        <w:t xml:space="preserve"> features associated with the quality of a response (Ramesh &amp; </w:t>
+      </w:r>
+      <w:proofErr w:type="spellStart"/>
+      <w:r>
+        <w:rPr>
+          <w:sz w:val="24"/>
+          <w:szCs w:val="24"/>
+        </w:rPr>
+        <w:t>Sanampudi</w:t>
+      </w:r>
+      <w:proofErr w:type="spellEnd"/>
+      <w:r>
+        <w:rPr>
+          <w:sz w:val="24"/>
+          <w:szCs w:val="24"/>
+        </w:rPr>
+        <w:t>, 2022; Susanti et al., 2023). Even so, automated scoring should not be expected to fully replace a teacher's judgment, since students may produce unique or unexpected answers that require human interpretation; recent evaluations of AES systems continue to emphasize the importance of accuracy, fairness, and appropriate human oversight before an automated score is treated as final (Yang et al., 2024).</w:t>
+      </w:r>
+    </w:p>
+    <w:p>
+      <w:pPr>
+        <w:spacing w:line="480" w:lineRule="auto"/>
+        <w:ind w:firstLine="720"/>
+        <w:jc w:val="both"/>
+      </w:pPr>
+      <w:r>
+        <w:rPr>
+          <w:sz w:val="24"/>
+          <w:szCs w:val="24"/>
+        </w:rPr>
+        <w:t xml:space="preserve">Checking assessments, however, is only one part of a teacher's workload. Before an assessment can even be given, teachers must prepare quiz items and instructional materials </w:t>
+      </w:r>
+      <w:r>
+        <w:rPr>
+          <w:sz w:val="24"/>
+          <w:szCs w:val="24"/>
+        </w:rPr>
+        <w:lastRenderedPageBreak/>
+        <w:t>aligned with the topics being taught, a task that has been identified as one of the most time-consuming and burdensome non-teaching responsibilities educators face (Hashem et al., 2024). Recent studies have examined how generative AI and large language models may assist teachers in this area. Question-generation approaches built around large language models, for example, have been used to help teachers produce quiz items aligned with specific learning goals, with some studies finding that teachers preferred quizzes that incorporated these AI-generated questions over those they wrote entirely on their own (Elkins et al., 2024). These findings suggest that AI-assisted content generation may help reduce the time teachers spend preparing instructional materials, provided that teachers remain able to review and adjust the resulting output.</w:t>
+      </w:r>
+    </w:p>
+    <w:p>
+      <w:pPr>
+        <w:spacing w:line="480" w:lineRule="auto"/>
+        <w:ind w:firstLine="720"/>
+        <w:jc w:val="both"/>
+      </w:pPr>
+      <w:r>
+        <w:rPr>
+          <w:sz w:val="24"/>
+          <w:szCs w:val="24"/>
+        </w:rPr>
+        <w:t>Beyond individual assessments and instructional materials, schools also need a way to monitor how students are performing over time so that those who may be struggling can be identified and supported before their difficulties worsen. Attendance and academic performance are commonly used indicators for this purpose, as students who are frequently absent or consistently scoring low are more likely to be at risk of falling behind (</w:t>
+      </w:r>
+      <w:proofErr w:type="spellStart"/>
+      <w:r>
+        <w:rPr>
+          <w:sz w:val="24"/>
+          <w:szCs w:val="24"/>
+        </w:rPr>
+        <w:t>Embarak</w:t>
+      </w:r>
+      <w:proofErr w:type="spellEnd"/>
+      <w:r>
+        <w:rPr>
+          <w:sz w:val="24"/>
+          <w:szCs w:val="24"/>
+        </w:rPr>
+        <w:t xml:space="preserve"> &amp; </w:t>
+      </w:r>
+      <w:proofErr w:type="spellStart"/>
+      <w:r>
+        <w:rPr>
+          <w:sz w:val="24"/>
+          <w:szCs w:val="24"/>
+        </w:rPr>
+        <w:t>Hawarna</w:t>
+      </w:r>
+      <w:proofErr w:type="spellEnd"/>
+      <w:r>
+        <w:rPr>
+          <w:sz w:val="24"/>
+          <w:szCs w:val="24"/>
+        </w:rPr>
+        <w:t>, 2024). Traditionally, this kind of monitoring is performed manually by teachers or guidance personnel who must review individual records across multiple classes, which can make it difficult to consistently identify at-risk students across an entire school population. Recent work applying data-driven and AI-based approaches to attendance and performance records has shown that such indicators can be used to classify students into different risk categories to support more timely intervention (</w:t>
+      </w:r>
+      <w:proofErr w:type="spellStart"/>
+      <w:r>
+        <w:rPr>
+          <w:sz w:val="24"/>
+          <w:szCs w:val="24"/>
+        </w:rPr>
+        <w:t>Embarak</w:t>
+      </w:r>
+      <w:proofErr w:type="spellEnd"/>
+      <w:r>
+        <w:rPr>
+          <w:sz w:val="24"/>
+          <w:szCs w:val="24"/>
+        </w:rPr>
+        <w:t xml:space="preserve"> &amp; </w:t>
+      </w:r>
+      <w:proofErr w:type="spellStart"/>
+      <w:r>
+        <w:rPr>
+          <w:sz w:val="24"/>
+          <w:szCs w:val="24"/>
+        </w:rPr>
+        <w:t>Hawarna</w:t>
+      </w:r>
+      <w:proofErr w:type="spellEnd"/>
+      <w:r>
+        <w:rPr>
+          <w:sz w:val="24"/>
+          <w:szCs w:val="24"/>
+        </w:rPr>
+        <w:t>, 2024).</w:t>
+      </w:r>
+    </w:p>
+    <w:p>
+      <w:pPr>
+        <w:spacing w:line="480" w:lineRule="auto"/>
+        <w:ind w:firstLine="720"/>
+        <w:jc w:val="both"/>
+      </w:pPr>
+      <w:r>
+        <w:rPr>
+          <w:sz w:val="24"/>
+          <w:szCs w:val="24"/>
+        </w:rPr>
+        <w:t xml:space="preserve">Taken together, checking paper-based and digital assessments, evaluating written responses, preparing quizzes and instructional materials, and monitoring student </w:t>
+      </w:r>
+      <w:r>
+        <w:rPr>
+          <w:sz w:val="24"/>
+          <w:szCs w:val="24"/>
+        </w:rPr>
+        <w:lastRenderedPageBreak/>
+        <w:t xml:space="preserve">performance for early signs of risk represent related but often separately addressed aspects of a teacher's workload. Existing tools tend to focus on only one of these tasks at a time, which leaves teachers to rely on multiple disconnected systems or to continue performing several of these tasks manually. In response to this, the present study explores the development of </w:t>
+      </w:r>
+      <w:proofErr w:type="spellStart"/>
+      <w:r>
+        <w:rPr>
+          <w:sz w:val="24"/>
+          <w:szCs w:val="24"/>
+        </w:rPr>
+        <w:t>ACTSight</w:t>
+      </w:r>
+      <w:proofErr w:type="spellEnd"/>
+      <w:r>
+        <w:rPr>
+          <w:sz w:val="24"/>
+          <w:szCs w:val="24"/>
+        </w:rPr>
+        <w:t>, a proposed system intended to bring OCR-based automated assessment, an agentic console for quiz automation, AI-assisted learning plan generation, and student retention analytics into a single system blueprint. This study is conducted within the context of ACTS Computer College, which serves as the research setting in which the relevant instructional processes and requirements were examined; the resulting blueprint, however, is intended to be adaptable by other schools and educational institutions with similar needs. The following sections describe the specific context, purpose, and scope of the proposed system in greater detail.</w:t>
+      </w:r>
+    </w:p>
+    <w:p>
+      <w:pPr>
+        <w:spacing w:line="480" w:lineRule="auto"/>
+        <w:jc w:val="center"/>
+      </w:pPr>
+      <w:r>
+        <w:rPr>
+          <w:b/>
+          <w:bCs/>
+          <w:sz w:val="24"/>
+          <w:szCs w:val="24"/>
+        </w:rPr>
+        <w:t>Project Context</w:t>
+      </w:r>
+    </w:p>
+    <w:p>
+      <w:pPr>
+        <w:spacing w:line="480" w:lineRule="auto"/>
+        <w:ind w:firstLine="720"/>
+        <w:jc w:val="both"/>
+      </w:pPr>
+      <w:r>
+        <w:rPr>
+          <w:sz w:val="24"/>
+          <w:szCs w:val="24"/>
+        </w:rPr>
+        <w:t>In the contemporary educational landscape, teachers are burdened with administrative tasks that consume a disproportionate amount of their working hours. A major contributor to this workload is the manual administration and checking of student assessments. Grading physical test papers—including multiple-choice sheets, handwritten essays, and code snippets—is highly susceptible to human error, cognitive fatigue, and severe delays that prevent timely feedback. While traditional Optical Mark Recognition (OMR) hardware exists, it is expensive and limited strictly to shaded exams. There is a pressing need for a software-based computer vision solution that leverages Optical Character Recognition (OCR) to automatically evaluate diverse physical exam formats and seamlessly generate analytics to scrutinize assessment answers and generate feedback</w:t>
+      </w:r>
+    </w:p>
+    <w:p>
+      <w:pPr>
+        <w:spacing w:line="480" w:lineRule="auto"/>
+        <w:ind w:firstLine="720"/>
+        <w:jc w:val="both"/>
+      </w:pPr>
+      <w:r>
+        <w:rPr>
+          <w:sz w:val="24"/>
+          <w:szCs w:val="24"/>
+        </w:rPr>
+        <w:lastRenderedPageBreak/>
+        <w:t>Beyond physical grading, designing Outcome-Based Education (OBE) learning materials presents a substantial cognitive challenge. Institutional frameworks mandate that curricula align strictly with measurable competencies and specific action verbs. Currently, teachers must manually extract concepts from lengthy slide decks to draft structured lesson plans and valid assessments, leading to exhaustion and inconsistent instructional quality. While Generative AI offers potential relief, educators often lack the time or technical proficiency for complex "prompt engineering." A streamlined, "zero-typing" ecosystem is necessary—one where educators can simply upload raw teaching materials and rely on an autonomous system to draft OBE-aligned content based on their saved preferences.</w:t>
+      </w:r>
+    </w:p>
+    <w:p>
+      <w:pPr>
+        <w:spacing w:line="480" w:lineRule="auto"/>
+        <w:ind w:firstLine="720"/>
+        <w:jc w:val="both"/>
+      </w:pPr>
+      <w:r>
+        <w:rPr>
+          <w:sz w:val="24"/>
+          <w:szCs w:val="24"/>
+        </w:rPr>
+        <w:t>Equally critical is the proactive monitoring of student engagement. Schools consistently struggle with student retention, as learners dealing with academic difficulties or chronic absenteeism fall through the cracks of fragmented data systems. Often, educators discover a student is at high risk of failing only at the end of a grading period, when pedagogical interventions are too late. Institutions require a predictive analytic framework that continuously evaluates running metrics to visually classify students into distinct risk categories in real time.</w:t>
+      </w:r>
+    </w:p>
+    <w:p>
+      <w:pPr>
+        <w:spacing w:line="480" w:lineRule="auto"/>
+        <w:ind w:firstLine="720"/>
+        <w:jc w:val="both"/>
+      </w:pPr>
+      <w:r>
+        <w:rPr>
+          <w:sz w:val="24"/>
+          <w:szCs w:val="24"/>
+        </w:rPr>
+        <w:t xml:space="preserve">To address these compounding challenges, this project proposes the development of </w:t>
+      </w:r>
+      <w:proofErr w:type="spellStart"/>
+      <w:r>
+        <w:rPr>
+          <w:sz w:val="24"/>
+          <w:szCs w:val="24"/>
+        </w:rPr>
+        <w:t>ACTSight</w:t>
+      </w:r>
+      <w:proofErr w:type="spellEnd"/>
+      <w:r>
+        <w:rPr>
+          <w:sz w:val="24"/>
+          <w:szCs w:val="24"/>
+        </w:rPr>
+        <w:t xml:space="preserve">: An OCR-Based Automated Assessment and Agentic Console for Quiz Automation, AI-Assisted Learning Plan Generation, and Student Retention Analytics. </w:t>
+      </w:r>
+      <w:proofErr w:type="spellStart"/>
+      <w:r>
+        <w:rPr>
+          <w:sz w:val="24"/>
+          <w:szCs w:val="24"/>
+        </w:rPr>
+        <w:t>ACTSight</w:t>
+      </w:r>
+      <w:proofErr w:type="spellEnd"/>
+      <w:r>
+        <w:rPr>
+          <w:sz w:val="24"/>
+          <w:szCs w:val="24"/>
+        </w:rPr>
+        <w:t xml:space="preserve"> is a comprehensive, AI-driven educational ecosystem designed to streamline the academic workflow. It features an OCR Assessment Engine that utilizes computer vision and alignment markers to digitize and grade physical answer sheets, essays, and code submissions. Concurrently, the Agentic Console employs a multi-agent Large Language </w:t>
+      </w:r>
+      <w:r>
+        <w:rPr>
+          <w:sz w:val="24"/>
+          <w:szCs w:val="24"/>
+        </w:rPr>
+        <w:lastRenderedPageBreak/>
+        <w:t xml:space="preserve">Model architecture to autonomously generate strictly formatted OBE learning </w:t>
+      </w:r>
+      <w:proofErr w:type="gramStart"/>
+      <w:r>
+        <w:rPr>
+          <w:sz w:val="24"/>
+          <w:szCs w:val="24"/>
+        </w:rPr>
+        <w:t>plans  without</w:t>
+      </w:r>
+      <w:proofErr w:type="gramEnd"/>
+      <w:r>
+        <w:rPr>
+          <w:sz w:val="24"/>
+          <w:szCs w:val="24"/>
+        </w:rPr>
+        <w:t xml:space="preserve"> typed prompts. Moreover, educators can generate, disseminate and check the quizzes generated by the agentic console, guided by the chosen AI Model– </w:t>
+      </w:r>
+      <w:proofErr w:type="spellStart"/>
+      <w:r>
+        <w:rPr>
+          <w:sz w:val="24"/>
+          <w:szCs w:val="24"/>
+        </w:rPr>
+        <w:t>Ollama</w:t>
+      </w:r>
+      <w:proofErr w:type="spellEnd"/>
+      <w:r>
+        <w:rPr>
+          <w:sz w:val="24"/>
+          <w:szCs w:val="24"/>
+        </w:rPr>
+        <w:t xml:space="preserve"> Qwen. Scores from digitized or online quizzes are instantly computed </w:t>
+      </w:r>
+      <w:proofErr w:type="gramStart"/>
+      <w:r>
+        <w:rPr>
+          <w:sz w:val="24"/>
+          <w:szCs w:val="24"/>
+        </w:rPr>
+        <w:t>using  dedicated</w:t>
+      </w:r>
+      <w:proofErr w:type="gramEnd"/>
+      <w:r>
+        <w:rPr>
+          <w:sz w:val="24"/>
+          <w:szCs w:val="24"/>
+        </w:rPr>
+        <w:t xml:space="preserve"> formulas and routed into a landscape-ready E-</w:t>
+      </w:r>
+      <w:proofErr w:type="spellStart"/>
+      <w:r>
+        <w:rPr>
+          <w:sz w:val="24"/>
+          <w:szCs w:val="24"/>
+        </w:rPr>
+        <w:t>ClassRecord</w:t>
+      </w:r>
+      <w:proofErr w:type="spellEnd"/>
+      <w:r>
+        <w:rPr>
+          <w:sz w:val="24"/>
+          <w:szCs w:val="24"/>
+        </w:rPr>
+        <w:t xml:space="preserve">. Finally, a Predictive At-Risk Analytics dashboard plots Assessment Scores and Attendance onto an interactive four-quadrant scatter plot, instantly categorizing students into actionable risk profiles. By unifying these technologies, </w:t>
+      </w:r>
+      <w:proofErr w:type="spellStart"/>
+      <w:r>
+        <w:rPr>
+          <w:sz w:val="24"/>
+          <w:szCs w:val="24"/>
+        </w:rPr>
+        <w:t>ACTSight</w:t>
+      </w:r>
+      <w:proofErr w:type="spellEnd"/>
+      <w:r>
+        <w:rPr>
+          <w:sz w:val="24"/>
+          <w:szCs w:val="24"/>
+        </w:rPr>
+        <w:t xml:space="preserve"> empowers educators to reclaim instructional time and ensures data-driven, proactive student interventions.</w:t>
+      </w:r>
+    </w:p>
+    <w:p>
+      <w:pPr>
+        <w:spacing w:line="480" w:lineRule="auto"/>
+        <w:jc w:val="center"/>
+      </w:pPr>
+      <w:r>
+        <w:rPr>
+          <w:b/>
+          <w:bCs/>
+          <w:sz w:val="24"/>
+          <w:szCs w:val="24"/>
+        </w:rPr>
+        <w:t>Purpose and Description of the Study</w:t>
+      </w:r>
+    </w:p>
+    <w:p>
+      <w:pPr>
+        <w:spacing w:line="480" w:lineRule="auto"/>
+        <w:ind w:firstLine="720"/>
+        <w:jc w:val="both"/>
+      </w:pPr>
+      <w:r>
+        <w:rPr>
+          <w:sz w:val="24"/>
+          <w:szCs w:val="24"/>
+        </w:rPr>
+        <w:t xml:space="preserve">The purpose of this study is to present </w:t>
+      </w:r>
+      <w:proofErr w:type="spellStart"/>
+      <w:r>
+        <w:rPr>
+          <w:sz w:val="24"/>
+          <w:szCs w:val="24"/>
+        </w:rPr>
+        <w:t>ACTSight</w:t>
+      </w:r>
+      <w:proofErr w:type="spellEnd"/>
+      <w:r>
+        <w:rPr>
+          <w:sz w:val="24"/>
+          <w:szCs w:val="24"/>
+        </w:rPr>
+        <w:t xml:space="preserve">: An OCR-Based Automated Assessment and Agentic Console for Quiz Automation, AI-Assisted Learning Plan Generation, and Student Retention Analytics, a proposed web-based educational system designed for administrators, teachers, and students, with functions and access permissions based on their assigned roles. </w:t>
+      </w:r>
+      <w:proofErr w:type="spellStart"/>
+      <w:r>
+        <w:rPr>
+          <w:sz w:val="24"/>
+          <w:szCs w:val="24"/>
+        </w:rPr>
+        <w:t>ACTSight</w:t>
+      </w:r>
+      <w:proofErr w:type="spellEnd"/>
+      <w:r>
+        <w:rPr>
+          <w:sz w:val="24"/>
+          <w:szCs w:val="24"/>
+        </w:rPr>
+        <w:t xml:space="preserve"> aims to address instructional and administrative tasks that may require significant manual work, particularly the checking of physical and digital assessments, the processing of objective and constructed-response questions, the generation of quizzes and instructional materials, the organization of assessment records, the computation of grades based on defined assessment criteria, the monitoring of student attendance and assessment performance, and the identification of students who may require attention based on available academic indicators. To support these functions, the proposed system combines optical character recognition (OCR) and optical mark recognition (OMR), natural language processing, machine learning, and agentic AI concepts within a single </w:t>
+      </w:r>
+      <w:r>
+        <w:rPr>
+          <w:sz w:val="24"/>
+          <w:szCs w:val="24"/>
+        </w:rPr>
+        <w:lastRenderedPageBreak/>
+        <w:t xml:space="preserve">system blueprint. </w:t>
+      </w:r>
+      <w:proofErr w:type="spellStart"/>
+      <w:r>
+        <w:rPr>
+          <w:sz w:val="24"/>
+          <w:szCs w:val="24"/>
+        </w:rPr>
+        <w:t>ACTSight</w:t>
+      </w:r>
+      <w:proofErr w:type="spellEnd"/>
+      <w:r>
+        <w:rPr>
+          <w:sz w:val="24"/>
+          <w:szCs w:val="24"/>
+        </w:rPr>
+        <w:t xml:space="preserve"> is not intended to replace teachers’ final decisions; where automated processing may be uncertain, the system is designed to provide mechanisms for teacher review or manual correction.</w:t>
+      </w:r>
+    </w:p>
+    <w:p>
+      <w:pPr>
+        <w:spacing w:line="480" w:lineRule="auto"/>
+        <w:ind w:firstLine="720"/>
+        <w:jc w:val="both"/>
+      </w:pPr>
+      <w:r>
+        <w:rPr>
+          <w:sz w:val="24"/>
+          <w:szCs w:val="24"/>
+        </w:rPr>
+        <w:t>To carry out this purpose, the proposed system integrates several core components. The Hybrid Assessment Ingestion and Automated Evaluation component supports the processing of both physical and digital assessments, including OMR-based checking of objective questions, OCR-based extraction of student information such as name and Learner Reference Number (LRN), and automated scoring of supported constructed responses, with uncertain results highlighted for teacher verification. The ACTS Agent Console is a task-executing conversational interface that allows a teacher to submit a natural-language request, which the system interprets and converts into structured parameters or actions for supported tasks such as quiz generation, quiz dissemination, and the retrieval of class performance information, without requiring the teacher to construct technical AI prompts. The ACTS Notebook is an AI-assisted instructional planning component that generates a structured lecture or discussion, organized into sections such as topic, learning objective, lecture or discussion, assessment, and resources, based on the teacher’s weekly detailed plan and related learning resources. The E-</w:t>
+      </w:r>
+      <w:proofErr w:type="spellStart"/>
+      <w:r>
+        <w:rPr>
+          <w:sz w:val="24"/>
+          <w:szCs w:val="24"/>
+        </w:rPr>
+        <w:t>Classrecord</w:t>
+      </w:r>
+      <w:proofErr w:type="spellEnd"/>
+      <w:r>
+        <w:rPr>
+          <w:sz w:val="24"/>
+          <w:szCs w:val="24"/>
+        </w:rPr>
+        <w:t xml:space="preserve"> provides teachers with a spreadsheet-like interface for organizing assessment components, assigning assessment weights, associating assessments with the corresponding grading or assessment period such as Prelim or Midterm, and computing grades according to teacher-defined criteria. The Student Retention Analytics component uses Attendance (AT) and Assessment Score (AS) as indicators to classify students into system-defined analytical categories, namely At Risk, For </w:t>
+      </w:r>
+      <w:proofErr w:type="spellStart"/>
+      <w:r>
+        <w:rPr>
+          <w:sz w:val="24"/>
+          <w:szCs w:val="24"/>
+        </w:rPr>
+        <w:t>Counseling</w:t>
+      </w:r>
+      <w:proofErr w:type="spellEnd"/>
+      <w:r>
+        <w:rPr>
+          <w:sz w:val="24"/>
+          <w:szCs w:val="24"/>
+        </w:rPr>
+        <w:t xml:space="preserve">, and Safe; these categories are intended to support the identification of attendance and </w:t>
+      </w:r>
+      <w:r>
+        <w:rPr>
+          <w:sz w:val="24"/>
+          <w:szCs w:val="24"/>
+        </w:rPr>
+        <w:lastRenderedPageBreak/>
+        <w:t xml:space="preserve">performance patterns rather than to serve as a complete assessment of a student’s personal circumstances. Lastly, the Virtual Classroom provides an isolated, student-facing environment where students may join classes through expiring </w:t>
+      </w:r>
+      <w:proofErr w:type="spellStart"/>
+      <w:r>
+        <w:rPr>
+          <w:sz w:val="24"/>
+          <w:szCs w:val="24"/>
+        </w:rPr>
+        <w:t>enrollment</w:t>
+      </w:r>
+      <w:proofErr w:type="spellEnd"/>
+      <w:r>
+        <w:rPr>
+          <w:sz w:val="24"/>
+          <w:szCs w:val="24"/>
+        </w:rPr>
+        <w:t xml:space="preserve"> codes, access instructional materials, complete online quizzes, and view their approved assessment results and performance information.</w:t>
+      </w:r>
+    </w:p>
+    <w:p>
+      <w:pPr>
+        <w:spacing w:line="480" w:lineRule="auto"/>
+        <w:ind w:firstLine="720"/>
+        <w:jc w:val="both"/>
+      </w:pPr>
+      <w:proofErr w:type="spellStart"/>
+      <w:r>
+        <w:rPr>
+          <w:sz w:val="24"/>
+          <w:szCs w:val="24"/>
+        </w:rPr>
+        <w:t>ACTSight</w:t>
+      </w:r>
+      <w:proofErr w:type="spellEnd"/>
+      <w:r>
+        <w:rPr>
+          <w:sz w:val="24"/>
+          <w:szCs w:val="24"/>
+        </w:rPr>
+        <w:t xml:space="preserve"> is intended primarily for four types of users, each with defined functions and access permissions. The Super Administrator is responsible for adding and validating institutions within the system. The School Administrator is responsible for institution-level management, including adding teacher accounts, assigning teachers to classes, and managing school calendars and grading periods. The Teacher is the primary user of the instructional and assessment-management functions and may use the ACTS Agent Console, the ACTS Notebook, assessment creation and processing, the E-</w:t>
+      </w:r>
+      <w:proofErr w:type="spellStart"/>
+      <w:r>
+        <w:rPr>
+          <w:sz w:val="24"/>
+          <w:szCs w:val="24"/>
+        </w:rPr>
+        <w:t>Classrecord</w:t>
+      </w:r>
+      <w:proofErr w:type="spellEnd"/>
+      <w:r>
+        <w:rPr>
+          <w:sz w:val="24"/>
+          <w:szCs w:val="24"/>
+        </w:rPr>
+        <w:t xml:space="preserve">, assessment tagging and grading-period management, performance monitoring, the review or correction of uncertain automated results, and the uploading of student rosters. The </w:t>
+      </w:r>
+      <w:proofErr w:type="gramStart"/>
+      <w:r>
+        <w:rPr>
+          <w:sz w:val="24"/>
+          <w:szCs w:val="24"/>
+        </w:rPr>
+        <w:t>Student</w:t>
+      </w:r>
+      <w:proofErr w:type="gramEnd"/>
+      <w:r>
+        <w:rPr>
+          <w:sz w:val="24"/>
+          <w:szCs w:val="24"/>
+        </w:rPr>
+        <w:t xml:space="preserve"> uses the isolated Virtual Classroom and related student-facing functions and does not have access to teacher-only functions such as the ACTS Agent Console and the ACTS Notebook.</w:t>
+      </w:r>
+    </w:p>
+    <w:p>
+      <w:pPr>
+        <w:spacing w:line="480" w:lineRule="auto"/>
+        <w:ind w:firstLine="720"/>
+        <w:jc w:val="both"/>
+      </w:pPr>
+      <w:r>
+        <w:rPr>
+          <w:sz w:val="24"/>
+          <w:szCs w:val="24"/>
+        </w:rPr>
+        <w:t xml:space="preserve">ACTS Computer College serves as the research setting and institutional context of the study, providing the educational processes, workflows, and requirements examined by the researchers. </w:t>
+      </w:r>
+      <w:proofErr w:type="spellStart"/>
+      <w:r>
+        <w:rPr>
+          <w:sz w:val="24"/>
+          <w:szCs w:val="24"/>
+        </w:rPr>
+        <w:t>ACTSight</w:t>
+      </w:r>
+      <w:proofErr w:type="spellEnd"/>
+      <w:r>
+        <w:rPr>
+          <w:sz w:val="24"/>
+          <w:szCs w:val="24"/>
+        </w:rPr>
+        <w:t xml:space="preserve">, however, is designed as a system blueprint rather than an institution-exclusive application; it is intended to be adaptable by other educational institutions according to their own requirements. Overall, the study aims to describe a system that combines automated assessment processing, AI-assisted instructional content generation, academic record management, and student performance and retention analytics </w:t>
+      </w:r>
+      <w:r>
+        <w:rPr>
+          <w:sz w:val="24"/>
+          <w:szCs w:val="24"/>
+        </w:rPr>
+        <w:lastRenderedPageBreak/>
+        <w:t>within a single educational platform, while preserving the teacher’s role in reviewing and finalizing academic outcomes.</w:t>
+      </w:r>
+    </w:p>
+    <w:p>
+      <w:pPr>
+        <w:spacing w:line="480" w:lineRule="auto"/>
+        <w:jc w:val="center"/>
+      </w:pPr>
+      <w:r>
+        <w:rPr>
+          <w:b/>
+          <w:bCs/>
+          <w:sz w:val="24"/>
+          <w:szCs w:val="24"/>
+        </w:rPr>
+        <w:t>Statement of the Problem</w:t>
+      </w:r>
+    </w:p>
+    <w:p>
+      <w:pPr>
+        <w:spacing w:line="480" w:lineRule="auto"/>
+        <w:ind w:firstLine="720"/>
+        <w:jc w:val="both"/>
+      </w:pPr>
+      <w:r>
+        <w:rPr>
+          <w:sz w:val="24"/>
+          <w:szCs w:val="24"/>
+        </w:rPr>
+        <w:t xml:space="preserve">Administrators, teachers, and students at educational institutions such as ACTS Computer College, the research setting of this study, continue to rely on largely manual processes for several instructional and administrative tasks. These tasks include checking physical and digital assessments, processing objective and constructed-response questions, generating quizzes and instructional materials, organizing assessment records, computing grades based on defined assessment criteria, monitoring student attendance and assessment performance, and identifying students who may require additional attention based on available academic indicators. Because these tasks are performed largely by hand, teachers may need to devote significant time and effort to routine assessment and record-keeping work, which can reduce the time available for instructional planning and direct student support. To help address these concerns, this study proposes </w:t>
+      </w:r>
+      <w:proofErr w:type="spellStart"/>
+      <w:r>
+        <w:rPr>
+          <w:sz w:val="24"/>
+          <w:szCs w:val="24"/>
+        </w:rPr>
+        <w:t>ACTSight</w:t>
+      </w:r>
+      <w:proofErr w:type="spellEnd"/>
+      <w:r>
+        <w:rPr>
+          <w:sz w:val="24"/>
+          <w:szCs w:val="24"/>
+        </w:rPr>
+        <w:t>: An OCR-Based Automated Assessment and Agentic Console for Quiz Automation, AI-Assisted Learning Plan Generation, and Student Retention Analytics, a proposed web-based educational system that combines optical character recognition (OCR) and optical mark recognition (OMR)-assisted assessment processing, AI-assisted instructional content generation, academic record management, and student performance and retention analytics within a single platform, while preserving the teacher's role in reviewing and finalizing academic outcomes.</w:t>
+      </w:r>
+    </w:p>
+    <w:p>
+      <w:pPr>
+        <w:spacing w:line="480" w:lineRule="auto"/>
+        <w:ind w:firstLine="720"/>
+        <w:jc w:val="both"/>
+      </w:pPr>
+      <w:r>
+        <w:rPr>
+          <w:sz w:val="24"/>
+          <w:szCs w:val="24"/>
+        </w:rPr>
+        <w:t>Specifically, this study aims to answer the following questions:</w:t>
+      </w:r>
+    </w:p>
+    <w:p>
+      <w:pPr>
+        <w:pStyle w:val="ListParagraph"/>
+        <w:numPr>
+          <w:ilvl w:val="0"/>
+          <w:numId w:val="1"/>
+        </w:numPr>
+        <w:spacing w:line="480" w:lineRule="auto"/>
+        <w:contextualSpacing w:val="0"/>
+        <w:jc w:val="both"/>
+      </w:pPr>
+      <w:r>
+        <w:rPr>
+          <w:sz w:val="24"/>
+          <w:szCs w:val="24"/>
+        </w:rPr>
+        <w:t xml:space="preserve">What role-based access and functions does the proposed </w:t>
+      </w:r>
+      <w:proofErr w:type="spellStart"/>
+      <w:r>
+        <w:rPr>
+          <w:sz w:val="24"/>
+          <w:szCs w:val="24"/>
+        </w:rPr>
+        <w:t>ACTSight</w:t>
+      </w:r>
+      <w:proofErr w:type="spellEnd"/>
+      <w:r>
+        <w:rPr>
+          <w:sz w:val="24"/>
+          <w:szCs w:val="24"/>
+        </w:rPr>
+        <w:t xml:space="preserve"> system provide for the Super Administrator, School Administrator, Teacher, and Student users?</w:t>
+      </w:r>
+    </w:p>
+    <w:p>
+      <w:pPr>
+        <w:pStyle w:val="ListParagraph"/>
+        <w:numPr>
+          <w:ilvl w:val="0"/>
+          <w:numId w:val="1"/>
+        </w:numPr>
+        <w:spacing w:line="480" w:lineRule="auto"/>
+        <w:contextualSpacing w:val="0"/>
+        <w:jc w:val="both"/>
+      </w:pPr>
+      <w:r>
+        <w:rPr>
+          <w:sz w:val="24"/>
+          <w:szCs w:val="24"/>
+        </w:rPr>
+        <w:lastRenderedPageBreak/>
+        <w:t>How does the proposed system process physical and digital assessments using optical character recognition (OCR) and optical mark recognition (OMR) for checking objective questions?</w:t>
+      </w:r>
+    </w:p>
+    <w:p>
+      <w:pPr>
+        <w:pStyle w:val="ListParagraph"/>
+        <w:numPr>
+          <w:ilvl w:val="0"/>
+          <w:numId w:val="1"/>
+        </w:numPr>
+        <w:spacing w:line="480" w:lineRule="auto"/>
+        <w:contextualSpacing w:val="0"/>
+        <w:jc w:val="both"/>
+      </w:pPr>
+      <w:r>
+        <w:rPr>
+          <w:sz w:val="24"/>
+          <w:szCs w:val="24"/>
+        </w:rPr>
+        <w:t>How does the proposed system perform automated scoring of supported responses, including short-answer, essay, and programming or code responses, while allowing teachers to verify low-confidence results?</w:t>
+      </w:r>
+    </w:p>
+    <w:p>
+      <w:pPr>
+        <w:pStyle w:val="ListParagraph"/>
+        <w:numPr>
+          <w:ilvl w:val="0"/>
+          <w:numId w:val="1"/>
+        </w:numPr>
+        <w:spacing w:line="480" w:lineRule="auto"/>
+        <w:contextualSpacing w:val="0"/>
+        <w:jc w:val="both"/>
+      </w:pPr>
+      <w:r>
+        <w:rPr>
+          <w:sz w:val="24"/>
+          <w:szCs w:val="24"/>
+        </w:rPr>
+        <w:t>How does the ACTS Agent Console allow teachers to perform supported tasks, such as quiz generation, quiz dissemination, and retrieval of class performance information, without requiring them to create technical AI prompts?</w:t>
+      </w:r>
+    </w:p>
+    <w:p>
+      <w:pPr>
+        <w:pStyle w:val="ListParagraph"/>
+        <w:numPr>
+          <w:ilvl w:val="0"/>
+          <w:numId w:val="1"/>
+        </w:numPr>
+        <w:spacing w:line="480" w:lineRule="auto"/>
+        <w:contextualSpacing w:val="0"/>
+        <w:jc w:val="both"/>
+      </w:pPr>
+      <w:r>
+        <w:rPr>
+          <w:sz w:val="24"/>
+          <w:szCs w:val="24"/>
+        </w:rPr>
+        <w:t>How does the ACTS Notebook generate structured lecture or discussion content based on the teacher's weekly detailed plan and related learning resources?</w:t>
+      </w:r>
+    </w:p>
+    <w:p>
+      <w:pPr>
+        <w:pStyle w:val="ListParagraph"/>
+        <w:numPr>
+          <w:ilvl w:val="0"/>
+          <w:numId w:val="1"/>
+        </w:numPr>
+        <w:spacing w:line="480" w:lineRule="auto"/>
+        <w:contextualSpacing w:val="0"/>
+        <w:jc w:val="both"/>
+      </w:pPr>
+      <w:r>
+        <w:rPr>
+          <w:sz w:val="24"/>
+          <w:szCs w:val="24"/>
+        </w:rPr>
+        <w:t>How does the E-</w:t>
+      </w:r>
+      <w:proofErr w:type="spellStart"/>
+      <w:r>
+        <w:rPr>
+          <w:sz w:val="24"/>
+          <w:szCs w:val="24"/>
+        </w:rPr>
+        <w:t>Classrecord</w:t>
+      </w:r>
+      <w:proofErr w:type="spellEnd"/>
+      <w:r>
+        <w:rPr>
+          <w:sz w:val="24"/>
+          <w:szCs w:val="24"/>
+        </w:rPr>
+        <w:t xml:space="preserve"> help teachers organize assessment components, assign assessment weights, and compute grades according to the corresponding grading period?</w:t>
+      </w:r>
+    </w:p>
+    <w:p>
+      <w:pPr>
+        <w:pStyle w:val="ListParagraph"/>
+        <w:numPr>
+          <w:ilvl w:val="0"/>
+          <w:numId w:val="1"/>
+        </w:numPr>
+        <w:spacing w:line="480" w:lineRule="auto"/>
+        <w:contextualSpacing w:val="0"/>
+        <w:jc w:val="both"/>
+      </w:pPr>
+      <w:r>
+        <w:rPr>
+          <w:sz w:val="24"/>
+          <w:szCs w:val="24"/>
+        </w:rPr>
+        <w:t>How does the proposed system classify students into retention analytics categories based on Attendance (AT) and Assessment Score (AS) indicators?</w:t>
+      </w:r>
+    </w:p>
+    <w:p>
+      <w:pPr>
+        <w:pStyle w:val="ListParagraph"/>
+        <w:numPr>
+          <w:ilvl w:val="0"/>
+          <w:numId w:val="1"/>
+        </w:numPr>
+        <w:spacing w:line="480" w:lineRule="auto"/>
+        <w:contextualSpacing w:val="0"/>
+        <w:jc w:val="both"/>
+      </w:pPr>
+      <w:r>
+        <w:rPr>
+          <w:sz w:val="24"/>
+          <w:szCs w:val="24"/>
+        </w:rPr>
+        <w:t>What functions are available to students through the Virtual Classroom?</w:t>
+      </w:r>
+    </w:p>
+    <w:p>
+      <w:pPr>
+        <w:pStyle w:val="ListParagraph"/>
+        <w:numPr>
+          <w:ilvl w:val="0"/>
+          <w:numId w:val="1"/>
+        </w:numPr>
+        <w:spacing w:line="480" w:lineRule="auto"/>
+        <w:contextualSpacing w:val="0"/>
+        <w:jc w:val="both"/>
+      </w:pPr>
+      <w:r>
+        <w:rPr>
+          <w:sz w:val="24"/>
+          <w:szCs w:val="24"/>
+        </w:rPr>
+        <w:t xml:space="preserve">What is the level of acceptability of the proposed </w:t>
+      </w:r>
+      <w:proofErr w:type="spellStart"/>
+      <w:r>
+        <w:rPr>
+          <w:sz w:val="24"/>
+          <w:szCs w:val="24"/>
+        </w:rPr>
+        <w:t>ACTSight</w:t>
+      </w:r>
+      <w:proofErr w:type="spellEnd"/>
+      <w:r>
+        <w:rPr>
+          <w:sz w:val="24"/>
+          <w:szCs w:val="24"/>
+        </w:rPr>
+        <w:t xml:space="preserve"> system as evaluated by its intended users?</w:t>
+      </w:r>
+    </w:p>
+    <w:p>
+      <w:pPr>
+        <w:spacing w:line="480" w:lineRule="auto"/>
+        <w:jc w:val="center"/>
+      </w:pPr>
+      <w:r>
+        <w:rPr>
+          <w:b/>
+          <w:bCs/>
+          <w:sz w:val="24"/>
+          <w:szCs w:val="24"/>
+        </w:rPr>
+        <w:t>Significance of the Study</w:t>
+      </w:r>
+    </w:p>
+    <w:p>
+      <w:pPr>
+        <w:spacing w:line="480" w:lineRule="auto"/>
+        <w:jc w:val="both"/>
+        <w:rPr>
+          <w:sz w:val="24"/>
+          <w:szCs w:val="24"/>
+        </w:rPr>
+      </w:pPr>
+      <w:r>
+        <w:rPr>
+          <w:sz w:val="24"/>
+          <w:szCs w:val="24"/>
+        </w:rPr>
+        <w:tab/>
+      </w:r>
+      <w:r>
+        <w:rPr>
+          <w:sz w:val="24"/>
+          <w:szCs w:val="24"/>
+        </w:rPr>
+        <w:t xml:space="preserve">This study is significant because it addresses recurring instructional and administrative concerns commonly encountered in educational settings, particularly the manual effort involved in checking physical and digital assessments, preparing instructional </w:t>
+      </w:r>
+      <w:r>
+        <w:rPr>
+          <w:sz w:val="24"/>
+          <w:szCs w:val="24"/>
+        </w:rPr>
+        <w:lastRenderedPageBreak/>
+        <w:t xml:space="preserve">materials, organizing academic records, and identifying students who may need additional attention. By combining hybrid assessment processing, an agentic task-execution interface, AI-assisted instructional planning, flexible academic record management, and attendance- and performance-based retention analytics within a single proposed system, </w:t>
+      </w:r>
+      <w:proofErr w:type="spellStart"/>
+      <w:r>
+        <w:rPr>
+          <w:sz w:val="24"/>
+          <w:szCs w:val="24"/>
+        </w:rPr>
+        <w:t>ACTSight</w:t>
+      </w:r>
+      <w:proofErr w:type="spellEnd"/>
+      <w:r>
+        <w:rPr>
+          <w:sz w:val="24"/>
+          <w:szCs w:val="24"/>
+        </w:rPr>
+        <w:t xml:space="preserve"> is designed to provide a more organized and consistent approach to these tasks. The design and results of this study may benefit the following: </w:t>
+      </w:r>
+    </w:p>
+    <w:p>
+      <w:pPr>
+        <w:spacing w:line="480" w:lineRule="auto"/>
+        <w:jc w:val="both"/>
+        <w:rPr>
+          <w:sz w:val="24"/>
+          <w:szCs w:val="24"/>
+        </w:rPr>
+      </w:pPr>
+      <w:r>
+        <w:rPr>
+          <w:sz w:val="24"/>
+          <w:szCs w:val="24"/>
+        </w:rPr>
+        <w:tab/>
+      </w:r>
+      <w:r>
+        <w:rPr>
+          <w:b/>
+          <w:bCs/>
+          <w:sz w:val="24"/>
+          <w:szCs w:val="24"/>
+        </w:rPr>
+        <w:t>Faculty.</w:t>
+      </w:r>
+      <w:r>
+        <w:rPr>
+          <w:sz w:val="24"/>
+          <w:szCs w:val="24"/>
+        </w:rPr>
+        <w:t xml:space="preserve"> Teachers may benefit from the proposed hybrid assessment processing capability, which is designed to support the checking of both physical and digital assessments through OCR and OMR, including objective questions and supported constructed responses, while highlighting low-confidence results for teacher verification rather than finalizing scores without review. Through the ACTS Agent Console, teachers may be able to request supported tasks such as quiz generation and dissemination using natural-language input, without needing to manually construct technical AI prompts. The ACTS Notebook may further assist teachers by generating structured lecture or discussion material based on their own weekly detailed plans and resources. In addition, the E-</w:t>
+      </w:r>
+      <w:proofErr w:type="spellStart"/>
+      <w:r>
+        <w:rPr>
+          <w:sz w:val="24"/>
+          <w:szCs w:val="24"/>
+        </w:rPr>
+        <w:t>Classrecord</w:t>
+      </w:r>
+      <w:proofErr w:type="spellEnd"/>
+      <w:r>
+        <w:rPr>
+          <w:sz w:val="24"/>
+          <w:szCs w:val="24"/>
+        </w:rPr>
+        <w:t xml:space="preserve"> is designed to give teachers a flexible way to organize assessment components, associate them with the appropriate grading period, and compute grades according to their own defined criteria. Taken together, these functions are intended to assist teachers in managing instructional and assessment-related tasks, rather than to replace their professional judgment or eliminate their workload. </w:t>
+      </w:r>
+    </w:p>
+    <w:p>
+      <w:pPr>
+        <w:spacing w:line="480" w:lineRule="auto"/>
+        <w:jc w:val="both"/>
+        <w:rPr>
+          <w:sz w:val="24"/>
+          <w:szCs w:val="24"/>
+        </w:rPr>
+      </w:pPr>
+      <w:r>
+        <w:rPr>
+          <w:sz w:val="24"/>
+          <w:szCs w:val="24"/>
+        </w:rPr>
+        <w:tab/>
+      </w:r>
+      <w:r>
+        <w:rPr>
+          <w:b/>
+          <w:bCs/>
+          <w:sz w:val="24"/>
+          <w:szCs w:val="24"/>
+        </w:rPr>
+        <w:t>Students.</w:t>
+      </w:r>
+      <w:r>
+        <w:rPr>
+          <w:sz w:val="24"/>
+          <w:szCs w:val="24"/>
+        </w:rPr>
+        <w:t xml:space="preserve"> Students may benefit from the Virtual Classroom, which is designed to give them access to instructional materials, complete online quizzes through unique URLs, and view their assessment results and approved performance-related information. Because </w:t>
+      </w:r>
+      <w:r>
+        <w:rPr>
+          <w:sz w:val="24"/>
+          <w:szCs w:val="24"/>
+        </w:rPr>
+        <w:lastRenderedPageBreak/>
+        <w:t xml:space="preserve">the system is intended to make assessment checking and record organization more consistent, students may experience clearer and more timely access to their academic standing, while teacher verification of automated results is intended to help maintain the reliability of the records that affect them. </w:t>
+      </w:r>
+    </w:p>
+    <w:p>
+      <w:pPr>
+        <w:spacing w:line="480" w:lineRule="auto"/>
+        <w:jc w:val="both"/>
+        <w:rPr>
+          <w:sz w:val="24"/>
+          <w:szCs w:val="24"/>
+        </w:rPr>
+      </w:pPr>
+      <w:r>
+        <w:rPr>
+          <w:sz w:val="24"/>
+          <w:szCs w:val="24"/>
+        </w:rPr>
+        <w:t xml:space="preserve">School Administrators. Administrators may benefit from the proposed institution-level management functions, which are designed to support tasks such as adding teacher accounts, assigning teachers to classes, managing academic calendars and grading periods, and organizing class assignments. The retention analytics component, which classifies students using attendance and assessment score indicators into system-defined categories, is intended to help administrators identify students who may benefit from further attention or </w:t>
+      </w:r>
+      <w:proofErr w:type="spellStart"/>
+      <w:r>
+        <w:rPr>
+          <w:sz w:val="24"/>
+          <w:szCs w:val="24"/>
+        </w:rPr>
+        <w:t>counseling</w:t>
+      </w:r>
+      <w:proofErr w:type="spellEnd"/>
+      <w:r>
+        <w:rPr>
+          <w:sz w:val="24"/>
+          <w:szCs w:val="24"/>
+        </w:rPr>
+        <w:t xml:space="preserve">. These classifications are meant to support, rather than substitute for, the administrators' and faculty's own understanding of individual student circumstances. </w:t>
+      </w:r>
+    </w:p>
+    <w:p>
+      <w:pPr>
+        <w:spacing w:line="480" w:lineRule="auto"/>
+        <w:jc w:val="both"/>
+        <w:rPr>
+          <w:sz w:val="24"/>
+          <w:szCs w:val="24"/>
+        </w:rPr>
+      </w:pPr>
+      <w:r>
+        <w:rPr>
+          <w:sz w:val="24"/>
+          <w:szCs w:val="24"/>
+        </w:rPr>
+        <w:tab/>
+      </w:r>
+      <w:r>
+        <w:rPr>
+          <w:b/>
+          <w:bCs/>
+          <w:sz w:val="24"/>
+          <w:szCs w:val="24"/>
+        </w:rPr>
+        <w:t>Future Researchers</w:t>
+      </w:r>
+      <w:r>
+        <w:rPr>
+          <w:sz w:val="24"/>
+          <w:szCs w:val="24"/>
+        </w:rPr>
+        <w:t xml:space="preserve">. This study may serve as a reference for future researchers interested in the design and integration of OCR/OMR-based assessment processing, automated evaluation of constructed responses, agentic AI interfaces, AI-assisted instructional content generation, and attendance- and performance-based retention analytics within a single educational system. Because </w:t>
+      </w:r>
+      <w:proofErr w:type="spellStart"/>
+      <w:r>
+        <w:rPr>
+          <w:sz w:val="24"/>
+          <w:szCs w:val="24"/>
+        </w:rPr>
+        <w:t>ACTSight</w:t>
+      </w:r>
+      <w:proofErr w:type="spellEnd"/>
+      <w:r>
+        <w:rPr>
+          <w:sz w:val="24"/>
+          <w:szCs w:val="24"/>
+        </w:rPr>
+        <w:t xml:space="preserve"> is proposed as a generalizable system blueprint rather than an application built exclusively for one institution, it may also provide a starting point for future studies that adapt similar functions to different institutional requirements, such as differing grading systems, academic calendars, or assessment formats. </w:t>
+      </w:r>
+    </w:p>
+    <w:p>
+      <w:pPr>
+        <w:spacing w:line="480" w:lineRule="auto"/>
+        <w:jc w:val="both"/>
+        <w:rPr>
+          <w:sz w:val="24"/>
+          <w:szCs w:val="24"/>
+        </w:rPr>
+      </w:pPr>
+      <w:r>
+        <w:rPr>
+          <w:sz w:val="24"/>
+          <w:szCs w:val="24"/>
+        </w:rPr>
+        <w:tab/>
+      </w:r>
+      <w:r>
+        <w:rPr>
+          <w:b/>
+          <w:bCs/>
+          <w:sz w:val="24"/>
+          <w:szCs w:val="24"/>
+        </w:rPr>
+        <w:t>Educational Technology Practitioners</w:t>
+      </w:r>
+      <w:r>
+        <w:rPr>
+          <w:sz w:val="24"/>
+          <w:szCs w:val="24"/>
+        </w:rPr>
+        <w:t xml:space="preserve">. Practitioners involved in designing or evaluating educational technology may find this study useful as an example of how OCR-based assessment automation, agentic task execution, and learning-analytics features can be </w:t>
+      </w:r>
+      <w:r>
+        <w:rPr>
+          <w:sz w:val="24"/>
+          <w:szCs w:val="24"/>
+        </w:rPr>
+        <w:lastRenderedPageBreak/>
+        <w:t xml:space="preserve">combined into one proposed system. Since institutions differ in their grading structures, academic policies, and existing workflows, the study may also offer practitioners a reference point for considering the adaptations that would be needed before similar functions could be applied in other educational settings. </w:t>
+      </w:r>
+    </w:p>
+    <w:p>
+      <w:pPr>
+        <w:spacing w:line="480" w:lineRule="auto"/>
+        <w:jc w:val="center"/>
+        <w:rPr>
+          <w:sz w:val="24"/>
+          <w:szCs w:val="24"/>
+        </w:rPr>
+      </w:pPr>
+      <w:r>
+        <w:rPr>
+          <w:sz w:val="24"/>
+          <w:szCs w:val="24"/>
+        </w:rPr>
+        <w:t xml:space="preserve"> </w:t>
+      </w:r>
+    </w:p>
+    <w:p>
+      <w:pPr>
+        <w:spacing w:line="480" w:lineRule="auto"/>
+        <w:jc w:val="center"/>
+        <w:rPr>
+          <w:sz w:val="24"/>
+          <w:szCs w:val="24"/>
+        </w:rPr>
+      </w:pPr>
+      <w:r>
+        <w:rPr>
+          <w:sz w:val="24"/>
+          <w:szCs w:val="24"/>
+        </w:rPr>
+        <w:t xml:space="preserve"> </w:t>
+      </w:r>
+    </w:p>
+    <w:p>
+      <w:pPr>
+        <w:spacing w:line="480" w:lineRule="auto"/>
+        <w:jc w:val="center"/>
+      </w:pPr>
+      <w:r>
+        <w:rPr>
+          <w:b/>
+          <w:bCs/>
+          <w:sz w:val="24"/>
+          <w:szCs w:val="24"/>
+        </w:rPr>
+        <w:t>Scope and Limitations of the Study</w:t>
+      </w:r>
+    </w:p>
+    <w:p>
+      <w:pPr>
+        <w:spacing w:line="480" w:lineRule="auto"/>
+        <w:ind w:firstLine="720"/>
+        <w:jc w:val="both"/>
+      </w:pPr>
+      <w:r>
+        <w:rPr>
+          <w:sz w:val="24"/>
+          <w:szCs w:val="24"/>
+        </w:rPr>
+        <w:t xml:space="preserve">This section presents the coverage of </w:t>
+      </w:r>
+      <w:proofErr w:type="spellStart"/>
+      <w:r>
+        <w:rPr>
+          <w:sz w:val="24"/>
+          <w:szCs w:val="24"/>
+        </w:rPr>
+        <w:t>ACTSight</w:t>
+      </w:r>
+      <w:proofErr w:type="spellEnd"/>
+      <w:r>
+        <w:rPr>
+          <w:sz w:val="24"/>
+          <w:szCs w:val="24"/>
+        </w:rPr>
+        <w:t xml:space="preserve"> and the boundaries that define the extent of the study and of the proposed system.</w:t>
+      </w:r>
+    </w:p>
+    <w:p>
+      <w:pPr>
+        <w:spacing w:line="480" w:lineRule="auto"/>
+        <w:ind w:firstLine="720"/>
+        <w:jc w:val="both"/>
+      </w:pPr>
+      <w:r>
+        <w:rPr>
+          <w:sz w:val="24"/>
+          <w:szCs w:val="24"/>
+        </w:rPr>
+        <w:t xml:space="preserve">This study covers the design and description of </w:t>
+      </w:r>
+      <w:proofErr w:type="spellStart"/>
+      <w:r>
+        <w:rPr>
+          <w:sz w:val="24"/>
+          <w:szCs w:val="24"/>
+        </w:rPr>
+        <w:t>ACTSight</w:t>
+      </w:r>
+      <w:proofErr w:type="spellEnd"/>
+      <w:r>
+        <w:rPr>
+          <w:sz w:val="24"/>
+          <w:szCs w:val="24"/>
+        </w:rPr>
+        <w:t xml:space="preserve">, a proposed web-based educational system intended to support automated assessment processing, AI-assisted instructional content generation, academic record management, and student performance and retention analytics within a single platform. ACTS Computer College serves as the research setting and institutional context of the study, providing the educational processes, workflows, and requirements examined by the researchers. </w:t>
+      </w:r>
+      <w:proofErr w:type="spellStart"/>
+      <w:r>
+        <w:rPr>
+          <w:sz w:val="24"/>
+          <w:szCs w:val="24"/>
+        </w:rPr>
+        <w:t>ACTSight</w:t>
+      </w:r>
+      <w:proofErr w:type="spellEnd"/>
+      <w:r>
+        <w:rPr>
+          <w:sz w:val="24"/>
+          <w:szCs w:val="24"/>
+        </w:rPr>
+        <w:t>, however, is designed as a system blueprint rather than an institution-exclusive application, and it is intended to be adaptable by other educational institutions according to their own requirements.</w:t>
+      </w:r>
+    </w:p>
+    <w:p>
+      <w:pPr>
+        <w:spacing w:line="480" w:lineRule="auto"/>
+        <w:ind w:firstLine="720"/>
+        <w:jc w:val="both"/>
+      </w:pPr>
+      <w:r>
+        <w:rPr>
+          <w:sz w:val="24"/>
+          <w:szCs w:val="24"/>
+        </w:rPr>
+        <w:t xml:space="preserve">The study is delimited to the following core components of </w:t>
+      </w:r>
+      <w:proofErr w:type="spellStart"/>
+      <w:r>
+        <w:rPr>
+          <w:sz w:val="24"/>
+          <w:szCs w:val="24"/>
+        </w:rPr>
+        <w:t>ACTSight</w:t>
+      </w:r>
+      <w:proofErr w:type="spellEnd"/>
+      <w:r>
+        <w:rPr>
+          <w:sz w:val="24"/>
+          <w:szCs w:val="24"/>
+        </w:rPr>
+        <w:t xml:space="preserve">. The Hybrid Assessment Ingestion and Automated Evaluation component covers the processing of both physical and digital assessments, including optical mark recognition (OMR) for objective questions, optical character recognition (OCR) for extracting student information such as name and Learner Reference Number (LRN), and automated scoring of supported constructed responses, with uncertain results highlighted for teacher verification. The ACTS </w:t>
+      </w:r>
+      <w:r>
+        <w:rPr>
+          <w:sz w:val="24"/>
+          <w:szCs w:val="24"/>
+        </w:rPr>
+        <w:lastRenderedPageBreak/>
+        <w:t>Agent Console is covered as a task-executing conversational interface that allows a teacher to submit a natural-language request, which the system interprets and converts into structured parameters or actions for supported tasks such as quiz generation, quiz dissemination, and the retrieval of class performance information, without requiring the teacher to construct technical AI prompts. The ACTS Notebook is covered as an AI-assisted instructional planning component that generates a structured lecture or discussion, organized into sections such as topic, learning objective, lecture or discussion, assessment, and resources, based on the teacher's weekly detailed plan and related learning resources. The E-</w:t>
+      </w:r>
+      <w:proofErr w:type="spellStart"/>
+      <w:r>
+        <w:rPr>
+          <w:sz w:val="24"/>
+          <w:szCs w:val="24"/>
+        </w:rPr>
+        <w:t>Classrecord</w:t>
+      </w:r>
+      <w:proofErr w:type="spellEnd"/>
+      <w:r>
+        <w:rPr>
+          <w:sz w:val="24"/>
+          <w:szCs w:val="24"/>
+        </w:rPr>
+        <w:t xml:space="preserve"> is covered as a spreadsheet-like interface that allows teachers to organize assessment components, assign assessment weights, associate assessments with the corresponding grading or assessment period such as Prelim or Midterm, and compute grades according to teacher-defined criteria. The Student Retention Analytics component is covered to the extent that it uses Attendance (AT) and Assessment Score (AS) as indicators to classify students into the system-defined categories of At Risk, For </w:t>
+      </w:r>
+      <w:proofErr w:type="spellStart"/>
+      <w:r>
+        <w:rPr>
+          <w:sz w:val="24"/>
+          <w:szCs w:val="24"/>
+        </w:rPr>
+        <w:t>Counseling</w:t>
+      </w:r>
+      <w:proofErr w:type="spellEnd"/>
+      <w:r>
+        <w:rPr>
+          <w:sz w:val="24"/>
+          <w:szCs w:val="24"/>
+        </w:rPr>
+        <w:t xml:space="preserve">, and Safe. Lastly, the Virtual Classroom is covered as an isolated, student-facing environment where students may join classes through expiring </w:t>
+      </w:r>
+      <w:proofErr w:type="spellStart"/>
+      <w:r>
+        <w:rPr>
+          <w:sz w:val="24"/>
+          <w:szCs w:val="24"/>
+        </w:rPr>
+        <w:t>enrollment</w:t>
+      </w:r>
+      <w:proofErr w:type="spellEnd"/>
+      <w:r>
+        <w:rPr>
+          <w:sz w:val="24"/>
+          <w:szCs w:val="24"/>
+        </w:rPr>
+        <w:t xml:space="preserve"> codes, access instructional materials, complete online quizzes, and view their approved assessment results and performance information.</w:t>
+      </w:r>
+    </w:p>
+    <w:p>
+      <w:pPr>
+        <w:spacing w:line="480" w:lineRule="auto"/>
+        <w:ind w:firstLine="720"/>
+        <w:jc w:val="both"/>
+      </w:pPr>
+      <w:proofErr w:type="spellStart"/>
+      <w:r>
+        <w:rPr>
+          <w:sz w:val="24"/>
+          <w:szCs w:val="24"/>
+        </w:rPr>
+        <w:t>ACTSight</w:t>
+      </w:r>
+      <w:proofErr w:type="spellEnd"/>
+      <w:r>
+        <w:rPr>
+          <w:sz w:val="24"/>
+          <w:szCs w:val="24"/>
+        </w:rPr>
+        <w:t xml:space="preserve"> is delimited to a responsive, web-based application rather than a native mobile application. Access to the system is likewise delimited by defined user roles and permissions, with teacher-only functions such as the ACTS Agent Console and the ACTS Notebook restricted from student accounts, and student-facing functions kept isolated from administrative and instructional-management functions. The physical assessment-processing component is further delimited to standardized, school-wide examination sheets designed </w:t>
+      </w:r>
+      <w:r>
+        <w:rPr>
+          <w:sz w:val="24"/>
+          <w:szCs w:val="24"/>
+        </w:rPr>
+        <w:lastRenderedPageBreak/>
+        <w:t>around fixed markers and coordinate information intended to assist with alignment and detection.</w:t>
+      </w:r>
+    </w:p>
+    <w:p>
+      <w:pPr>
+        <w:spacing w:line="480" w:lineRule="auto"/>
+        <w:ind w:firstLine="720"/>
+        <w:jc w:val="both"/>
+      </w:pPr>
+      <w:r>
+        <w:rPr>
+          <w:sz w:val="24"/>
+          <w:szCs w:val="24"/>
+        </w:rPr>
+        <w:t>The following limitations define the constraints that qualify the coverage and application of the proposed system.</w:t>
+      </w:r>
+    </w:p>
+    <w:p>
+      <w:pPr>
+        <w:spacing w:line="480" w:lineRule="auto"/>
+        <w:ind w:firstLine="720"/>
+        <w:jc w:val="both"/>
+      </w:pPr>
+      <w:proofErr w:type="spellStart"/>
+      <w:r>
+        <w:rPr>
+          <w:sz w:val="24"/>
+          <w:szCs w:val="24"/>
+        </w:rPr>
+        <w:t>ACTSight</w:t>
+      </w:r>
+      <w:proofErr w:type="spellEnd"/>
+      <w:r>
+        <w:rPr>
+          <w:sz w:val="24"/>
+          <w:szCs w:val="24"/>
+        </w:rPr>
+        <w:t xml:space="preserve"> is not intended to replace the teacher's final academic decisions. Where automated processing, such as OCR extraction, OMR checking, or the automated scoring of constructed responses, produces uncertain or low-confidence results, the system is designed to highlight these results for teacher review rather than to finalize them independently. The reliability of the system's automated outputs therefore remains dependent on teacher verification and, where applicable, manual correction.</w:t>
+      </w:r>
+    </w:p>
+    <w:p>
+      <w:pPr>
+        <w:spacing w:line="480" w:lineRule="auto"/>
+        <w:ind w:firstLine="720"/>
+        <w:jc w:val="both"/>
+      </w:pPr>
+      <w:r>
+        <w:rPr>
+          <w:sz w:val="24"/>
+          <w:szCs w:val="24"/>
+        </w:rPr>
+        <w:t xml:space="preserve">The Student Retention Analytics component classifies students using only two indicators, namely Attendance (AT) and Assessment Score (AS). The resulting classifications, At Risk, For </w:t>
+      </w:r>
+      <w:proofErr w:type="spellStart"/>
+      <w:r>
+        <w:rPr>
+          <w:sz w:val="24"/>
+          <w:szCs w:val="24"/>
+        </w:rPr>
+        <w:t>Counseling</w:t>
+      </w:r>
+      <w:proofErr w:type="spellEnd"/>
+      <w:r>
+        <w:rPr>
+          <w:sz w:val="24"/>
+          <w:szCs w:val="24"/>
+        </w:rPr>
+        <w:t xml:space="preserve">, and Safe, are system-defined analytical categories based solely on these two indicators and are not intended to serve as a complete assessment of a student's personal circumstances or as a definitive prediction of future </w:t>
+      </w:r>
+      <w:proofErr w:type="spellStart"/>
+      <w:r>
+        <w:rPr>
+          <w:sz w:val="24"/>
+          <w:szCs w:val="24"/>
+        </w:rPr>
+        <w:t>behavior</w:t>
+      </w:r>
+      <w:proofErr w:type="spellEnd"/>
+      <w:r>
+        <w:rPr>
+          <w:sz w:val="24"/>
+          <w:szCs w:val="24"/>
+        </w:rPr>
+        <w:t>.</w:t>
+      </w:r>
+    </w:p>
+    <w:p>
+      <w:pPr>
+        <w:spacing w:line="480" w:lineRule="auto"/>
+        <w:ind w:firstLine="720"/>
+        <w:jc w:val="both"/>
+      </w:pPr>
+      <w:r>
+        <w:rPr>
+          <w:sz w:val="24"/>
+          <w:szCs w:val="24"/>
+        </w:rPr>
+        <w:t xml:space="preserve">Because ACTS Computer College serves as the research setting and institutional context of the study, the requirements and workflows examined are grounded primarily in that institution's practices. While </w:t>
+      </w:r>
+      <w:proofErr w:type="spellStart"/>
+      <w:r>
+        <w:rPr>
+          <w:sz w:val="24"/>
+          <w:szCs w:val="24"/>
+        </w:rPr>
+        <w:t>ACTSight</w:t>
+      </w:r>
+      <w:proofErr w:type="spellEnd"/>
+      <w:r>
+        <w:rPr>
+          <w:sz w:val="24"/>
+          <w:szCs w:val="24"/>
+        </w:rPr>
+        <w:t xml:space="preserve"> is designed as an adaptable system blueprint, the extent to which its underlying assumptions apply to other educational institutions without modification is not established within the scope of this study.</w:t>
+      </w:r>
+    </w:p>
+    <w:p>
+      <w:pPr>
+        <w:spacing w:line="480" w:lineRule="auto"/>
+        <w:ind w:firstLine="720"/>
+        <w:jc w:val="both"/>
+      </w:pPr>
+      <w:r>
+        <w:rPr>
+          <w:sz w:val="24"/>
+          <w:szCs w:val="24"/>
+        </w:rPr>
+        <w:t xml:space="preserve">The current technical direction of </w:t>
+      </w:r>
+      <w:proofErr w:type="spellStart"/>
+      <w:r>
+        <w:rPr>
+          <w:sz w:val="24"/>
+          <w:szCs w:val="24"/>
+        </w:rPr>
+        <w:t>ACTSight</w:t>
+      </w:r>
+      <w:proofErr w:type="spellEnd"/>
+      <w:r>
+        <w:rPr>
+          <w:sz w:val="24"/>
+          <w:szCs w:val="24"/>
+        </w:rPr>
+        <w:t xml:space="preserve">, which includes OpenCV, Tesseract OCR, CLAHE preprocessing, </w:t>
+      </w:r>
+      <w:proofErr w:type="spellStart"/>
+      <w:r>
+        <w:rPr>
+          <w:sz w:val="24"/>
+          <w:szCs w:val="24"/>
+        </w:rPr>
+        <w:t>ArUco</w:t>
+      </w:r>
+      <w:proofErr w:type="spellEnd"/>
+      <w:r>
+        <w:rPr>
+          <w:sz w:val="24"/>
+          <w:szCs w:val="24"/>
+        </w:rPr>
+        <w:t xml:space="preserve"> marker detection, </w:t>
+      </w:r>
+      <w:proofErr w:type="spellStart"/>
+      <w:r>
+        <w:rPr>
+          <w:sz w:val="24"/>
+          <w:szCs w:val="24"/>
+        </w:rPr>
+        <w:t>DistilBERT</w:t>
+      </w:r>
+      <w:proofErr w:type="spellEnd"/>
+      <w:r>
+        <w:rPr>
+          <w:sz w:val="24"/>
+          <w:szCs w:val="24"/>
+        </w:rPr>
+        <w:t xml:space="preserve">, Quadratic Weighted Kappa (QWK) for scoring evaluation, and </w:t>
+      </w:r>
+      <w:proofErr w:type="spellStart"/>
+      <w:r>
+        <w:rPr>
+          <w:sz w:val="24"/>
+          <w:szCs w:val="24"/>
+        </w:rPr>
+        <w:t>Ollama</w:t>
+      </w:r>
+      <w:proofErr w:type="spellEnd"/>
+      <w:r>
+        <w:rPr>
+          <w:sz w:val="24"/>
+          <w:szCs w:val="24"/>
+        </w:rPr>
+        <w:t xml:space="preserve"> with a Qwen-family model for the </w:t>
+      </w:r>
+      <w:r>
+        <w:rPr>
+          <w:sz w:val="24"/>
+          <w:szCs w:val="24"/>
+        </w:rPr>
+        <w:lastRenderedPageBreak/>
+        <w:t>conversational and agentic AI component, reflects the project's technical direction at the time of writing. These technologies may be refined as development and consultation proceed, and this study does not present them as final or permanent implementation decisions.</w:t>
+      </w:r>
+    </w:p>
+    <w:p>
+      <w:pPr>
+        <w:spacing w:line="480" w:lineRule="auto"/>
+        <w:jc w:val="center"/>
+      </w:pPr>
+      <w:r>
+        <w:rPr>
+          <w:b/>
+          <w:bCs/>
+          <w:sz w:val="24"/>
+          <w:szCs w:val="24"/>
+        </w:rPr>
+        <w:t>REFERENCES</w:t>
+      </w:r>
+    </w:p>
+    <w:p>
+      <w:pPr>
+        <w:spacing w:line="480" w:lineRule="auto"/>
+      </w:pPr>
+    </w:p>
+    <w:p>
+      <w:pPr>
+        <w:ind w:left="720" w:hanging="720"/>
+      </w:pPr>
+      <w:r>
+        <w:rPr>
+          <w:sz w:val="24"/>
+          <w:szCs w:val="24"/>
+        </w:rPr>
+        <w:t>Elkins, S., Kochmar, E., Cheung, J. C. K., &amp; Serban, I. (2024). How teachers can use large language models and Bloom's taxonomy to create educational quizzes. Proceedings of the AAAI Conference on Artificial Intelligence, 38(21), 23084–23091. https://doi.org/10.1609/aaai.v38i21.30353</w:t>
+      </w:r>
+    </w:p>
+    <w:p>
+      <w:pPr>
+        <w:ind w:left="720" w:hanging="720"/>
+      </w:pPr>
+      <w:proofErr w:type="spellStart"/>
+      <w:r>
+        <w:rPr>
+          <w:sz w:val="24"/>
+          <w:szCs w:val="24"/>
+        </w:rPr>
+        <w:t>Embarak</w:t>
+      </w:r>
+      <w:proofErr w:type="spellEnd"/>
+      <w:r>
+        <w:rPr>
+          <w:sz w:val="24"/>
+          <w:szCs w:val="24"/>
+        </w:rPr>
+        <w:t xml:space="preserve">, O. H., &amp; </w:t>
+      </w:r>
+      <w:proofErr w:type="spellStart"/>
+      <w:r>
+        <w:rPr>
+          <w:sz w:val="24"/>
+          <w:szCs w:val="24"/>
+        </w:rPr>
+        <w:t>Hawarna</w:t>
+      </w:r>
+      <w:proofErr w:type="spellEnd"/>
+      <w:r>
+        <w:rPr>
+          <w:sz w:val="24"/>
+          <w:szCs w:val="24"/>
+        </w:rPr>
+        <w:t>, S. (2024). Automated AI-driven system for early detection of at-risk students. Procedia Computer Science, 231, 151–160. https://doi.org/10.1016/j.procs.2023.12.187</w:t>
+      </w:r>
+    </w:p>
+    <w:p>
+      <w:pPr>
+        <w:ind w:left="720" w:hanging="720"/>
+      </w:pPr>
+      <w:r>
+        <w:rPr>
+          <w:sz w:val="24"/>
+          <w:szCs w:val="24"/>
+        </w:rPr>
+        <w:t>Hashem, R., Ali, N., El Zein, F., Fidalgo, P., &amp; Abu Khurma, O. (2024). AI to the rescue: Exploring the potential of ChatGPT as a teacher ally for workload relief and burnout prevention. Research and Practice in Technology Enhanced Learning, 19, Article 023. https://doi.org/10.58459/rptel.2024.19023</w:t>
+      </w:r>
+    </w:p>
+    <w:p>
+      <w:pPr>
+        <w:ind w:left="720" w:hanging="720"/>
+      </w:pPr>
+      <w:r>
+        <w:rPr>
+          <w:sz w:val="24"/>
+          <w:szCs w:val="24"/>
+        </w:rPr>
+        <w:t>Rajagopal, R. D., &amp; Saha, B. (2024). Optical mark recognition (OMR) automated grading using OpenCV. AIP Conference Proceedings, 3075(1), Article 020200. https://doi.org/10.1063/5.0219019</w:t>
+      </w:r>
+    </w:p>
+    <w:p>
+      <w:pPr>
+        <w:ind w:left="720" w:hanging="720"/>
+      </w:pPr>
+      <w:r>
+        <w:rPr>
+          <w:sz w:val="24"/>
+          <w:szCs w:val="24"/>
+        </w:rPr>
+        <w:t xml:space="preserve">Ramesh, D., &amp; </w:t>
+      </w:r>
+      <w:proofErr w:type="spellStart"/>
+      <w:r>
+        <w:rPr>
+          <w:sz w:val="24"/>
+          <w:szCs w:val="24"/>
+        </w:rPr>
+        <w:t>Sanampudi</w:t>
+      </w:r>
+      <w:proofErr w:type="spellEnd"/>
+      <w:r>
+        <w:rPr>
+          <w:sz w:val="24"/>
+          <w:szCs w:val="24"/>
+        </w:rPr>
+        <w:t xml:space="preserve">, S. K. (2022). An </w:t>
+      </w:r>
+      <w:proofErr w:type="gramStart"/>
+      <w:r>
+        <w:rPr>
+          <w:sz w:val="24"/>
+          <w:szCs w:val="24"/>
+        </w:rPr>
+        <w:t>automated essay scoring systems</w:t>
+      </w:r>
+      <w:proofErr w:type="gramEnd"/>
+      <w:r>
+        <w:rPr>
+          <w:sz w:val="24"/>
+          <w:szCs w:val="24"/>
+        </w:rPr>
+        <w:t>: A systematic literature review. Artificial Intelligence Review, 55(3), 2495–2527. https://doi.org/10.1007/s10462-021-10068-2</w:t>
+      </w:r>
+    </w:p>
+    <w:p>
+      <w:pPr>
+        <w:ind w:left="720" w:hanging="720"/>
+      </w:pPr>
+      <w:r>
+        <w:rPr>
+          <w:sz w:val="24"/>
+          <w:szCs w:val="24"/>
+        </w:rPr>
+        <w:t xml:space="preserve">Susanti, M. N. I., Ramadhan, A., &amp; </w:t>
+      </w:r>
+      <w:proofErr w:type="spellStart"/>
+      <w:r>
+        <w:rPr>
+          <w:sz w:val="24"/>
+          <w:szCs w:val="24"/>
+        </w:rPr>
+        <w:t>Warnars</w:t>
+      </w:r>
+      <w:proofErr w:type="spellEnd"/>
+      <w:r>
+        <w:rPr>
+          <w:sz w:val="24"/>
+          <w:szCs w:val="24"/>
+        </w:rPr>
+        <w:t>, H. L. H. S. (2023). Automatic essay exam scoring system: A systematic literature review. Procedia Computer Science, 216, 531–538. https://doi.org/10.1016/j.procs.2022.12.166</w:t>
+      </w:r>
+    </w:p>
+    <w:p>
+      <w:pPr>
+        <w:ind w:left="720" w:hanging="720"/>
+      </w:pPr>
+      <w:r>
+        <w:rPr>
+          <w:sz w:val="24"/>
+          <w:szCs w:val="24"/>
+        </w:rPr>
+        <w:t xml:space="preserve">Yang, K., </w:t>
+      </w:r>
+      <w:proofErr w:type="spellStart"/>
+      <w:r>
+        <w:rPr>
+          <w:sz w:val="24"/>
+          <w:szCs w:val="24"/>
+        </w:rPr>
+        <w:t>Rakóvic</w:t>
+      </w:r>
+      <w:proofErr w:type="spellEnd"/>
+      <w:r>
+        <w:rPr>
+          <w:sz w:val="24"/>
+          <w:szCs w:val="24"/>
+        </w:rPr>
+        <w:t xml:space="preserve">́, M., Li, Y., Guan, Q., </w:t>
+      </w:r>
+      <w:proofErr w:type="spellStart"/>
+      <w:r>
+        <w:rPr>
+          <w:sz w:val="24"/>
+          <w:szCs w:val="24"/>
+        </w:rPr>
+        <w:t>Gaševic</w:t>
+      </w:r>
+      <w:proofErr w:type="spellEnd"/>
+      <w:r>
+        <w:rPr>
+          <w:sz w:val="24"/>
+          <w:szCs w:val="24"/>
+        </w:rPr>
+        <w:t>́, D., &amp; Chen, G. (2024). Unveiling the tapestry of automated essay scoring: A comprehensive investigation of accuracy, fairness, and generalizability. Proceedings of the AAAI Conference on Artificial Intelligence, 38(20), 22466–22474. https://doi.org/10.1609/aaai.v38i20.30254</w:t>
+      </w:r>
+    </w:p>
+    <w:p>
+      <w:pPr>
+        <w:spacing w:line="480" w:lineRule="auto"/>
+        <w:jc w:val="center"/>
+        <w:rPr>
           <w:sz w:val="24"/>
           <w:szCs w:val="24"/>
         </w:rPr>
       </w:pPr>
     </w:p>
     <w:sectPr>
-      <w:footerReference w:type="default" r:id="rId6"/>
+      <w:footerReference w:type="default" r:id="rId7"/>
       <w:pgSz w:w="12240" w:h="15840"/>
       <w:pgMar w:top="1440" w:right="1701" w:bottom="1440" w:left="1701" w:header="709" w:footer="709" w:gutter="0"/>
       <w:cols w:space="708"/>
@@ -29,9 +2015,6 @@
 <w:endnotes xmlns:wpc="http://schemas.microsoft.com/office/word/2010/wordprocessingCanvas" xmlns:cx="http://schemas.microsoft.com/office/drawing/2014/chartex" xmlns:cx1="http://schemas.microsoft.com/office/drawing/2015/9/8/chartex" xmlns:cx2="http://schemas.microsoft.com/office/drawing/2015/10/21/chartex" xmlns:cx3="http://schemas.microsoft.com/office/drawing/2016/5/9/chartex" xmlns:cx4="http://schemas.microsoft.com/office/drawing/2016/5/10/chartex" xmlns:cx5="http://schemas.microsoft.com/office/drawing/2016/5/11/chartex" xmlns:cx6="http://schemas.microsoft.com/office/drawing/2016/5/12/chartex" xmlns:cx7="http://schemas.microsoft.com/office/drawing/2016/5/13/chartex" xmlns:cx8="http://schemas.microsoft.com/office/drawing/2016/5/14/chartex" xmlns:mc="http://schemas.openxmlformats.org/markup-compatibility/2006" xmlns:aink="http://schemas.microsoft.com/office/drawing/2016/ink" xmlns:am3d="http://schemas.microsoft.com/office/drawing/2017/model3d" xmlns:o="urn:schemas-microsoft-com:office:office" xmlns:oel="http://schemas.microsoft.com/office/2019/extlst" xmlns:r="http://schemas.openxmlformats.org/officeDocument/2006/relationships" xmlns:m="http://schemas.openxmlformats.org/officeDocument/2006/math" xmlns:v="urn:schemas-microsoft-com:vml" xmlns:wp14="http://schemas.microsoft.com/office/word/2010/wordprocessingDrawing" xmlns:wp="http://schemas.openxmlformats.org/drawingml/2006/wordprocessingDrawing" xmlns:w10="urn:schemas-microsoft-com:office:word" xmlns:w="http://schemas.openxmlformats.org/wordprocessingml/2006/main" xmlns:w14="http://schemas.microsoft.com/office/word/2010/wordml" xmlns:w15="http://schemas.microsoft.com/office/word/2012/wordml" xmlns:w16cex="http://schemas.microsoft.com/office/word/2018/wordml/cex" xmlns:w16cid="http://schemas.microsoft.com/office/word/2016/wordml/cid" xmlns:w16="http://schemas.microsoft.com/office/word/2018/wordml" xmlns:w16du="http://schemas.microsoft.com/office/word/2023/wordml/word16du" xmlns:w16sdtdh="http://schemas.microsoft.com/office/word/2020/wordml/sdtdatahash" xmlns:w16sdtfl="http://schemas.microsoft.com/office/word/2024/wordml/sdtformatlock" xmlns:w16se="http://schemas.microsoft.com/office/word/2015/wordml/symex" xmlns:wpg="http://schemas.microsoft.com/office/word/2010/wordprocessingGroup" xmlns:wpi="http://schemas.microsoft.com/office/word/2010/wordprocessingInk" xmlns:wne="http://schemas.microsoft.com/office/word/2006/wordml" xmlns:wps="http://schemas.microsoft.com/office/word/2010/wordprocessingShape" mc:Ignorable="w14 w15 w16se w16cid w16 w16cex w16sdtdh w16sdtfl w16du wp14">
   <w:endnote w:type="separator" w:id="-1">
     <w:p>
-      <w:pPr>
-        <w:spacing w:after="0" w:line="240" w:lineRule="auto"/>
-      </w:pPr>
       <w:r>
         <w:separator/>
       </w:r>
@@ -39,9 +2022,6 @@
   </w:endnote>
   <w:endnote w:type="continuationSeparator" w:id="0">
     <w:p>
-      <w:pPr>
-        <w:spacing w:after="0" w:line="240" w:lineRule="auto"/>
-      </w:pPr>
       <w:r>
         <w:continuationSeparator/>
       </w:r>
@@ -70,9 +2050,6 @@
         <w:pPr>
           <w:pStyle w:val="Footer"/>
           <w:jc w:val="center"/>
-          <w:rPr>
-            <w:rFonts w:ascii="Times New Roman" w:hAnsi="Times New Roman" w:cs="Times New Roman"/>
-          </w:rPr>
         </w:pPr>
       </w:p>
       <w:p>
@@ -116,9 +2093,6 @@
 <w:footnotes xmlns:wpc="http://schemas.microsoft.com/office/word/2010/wordprocessingCanvas" xmlns:cx="http://schemas.microsoft.com/office/drawing/2014/chartex" xmlns:cx1="http://schemas.microsoft.com/office/drawing/2015/9/8/chartex" xmlns:cx2="http://schemas.microsoft.com/office/drawing/2015/10/21/chartex" xmlns:cx3="http://schemas.microsoft.com/office/drawing/2016/5/9/chartex" xmlns:cx4="http://schemas.microsoft.com/office/drawing/2016/5/10/chartex" xmlns:cx5="http://schemas.microsoft.com/office/drawing/2016/5/11/chartex" xmlns:cx6="http://schemas.microsoft.com/office/drawing/2016/5/12/chartex" xmlns:cx7="http://schemas.microsoft.com/office/drawing/2016/5/13/chartex" xmlns:cx8="http://schemas.microsoft.com/office/drawing/2016/5/14/chartex" xmlns:mc="http://schemas.openxmlformats.org/markup-compatibility/2006" xmlns:aink="http://schemas.microsoft.com/office/drawing/2016/ink" xmlns:am3d="http://schemas.microsoft.com/office/drawing/2017/model3d" xmlns:o="urn:schemas-microsoft-com:office:office" xmlns:oel="http://schemas.microsoft.com/office/2019/extlst" xmlns:r="http://schemas.openxmlformats.org/officeDocument/2006/relationships" xmlns:m="http://schemas.openxmlformats.org/officeDocument/2006/math" xmlns:v="urn:schemas-microsoft-com:vml" xmlns:wp14="http://schemas.microsoft.com/office/word/2010/wordprocessingDrawing" xmlns:wp="http://schemas.openxmlformats.org/drawingml/2006/wordprocessingDrawing" xmlns:w10="urn:schemas-microsoft-com:office:word" xmlns:w="http://schemas.openxmlformats.org/wordprocessingml/2006/main" xmlns:w14="http://schemas.microsoft.com/office/word/2010/wordml" xmlns:w15="http://schemas.microsoft.com/office/word/2012/wordml" xmlns:w16cex="http://schemas.microsoft.com/office/word/2018/wordml/cex" xmlns:w16cid="http://schemas.microsoft.com/office/word/2016/wordml/cid" xmlns:w16="http://schemas.microsoft.com/office/word/2018/wordml" xmlns:w16du="http://schemas.microsoft.com/office/word/2023/wordml/word16du" xmlns:w16sdtdh="http://schemas.microsoft.com/office/word/2020/wordml/sdtdatahash" xmlns:w16sdtfl="http://schemas.microsoft.com/office/word/2024/wordml/sdtformatlock" xmlns:w16se="http://schemas.microsoft.com/office/word/2015/wordml/symex" xmlns:wpg="http://schemas.microsoft.com/office/word/2010/wordprocessingGroup" xmlns:wpi="http://schemas.microsoft.com/office/word/2010/wordprocessingInk" xmlns:wne="http://schemas.microsoft.com/office/word/2006/wordml" xmlns:wps="http://schemas.microsoft.com/office/word/2010/wordprocessingShape" mc:Ignorable="w14 w15 w16se w16cid w16 w16cex w16sdtdh w16sdtfl w16du wp14">
   <w:footnote w:type="separator" w:id="-1">
     <w:p>
-      <w:pPr>
-        <w:spacing w:after="0" w:line="240" w:lineRule="auto"/>
-      </w:pPr>
       <w:r>
         <w:separator/>
       </w:r>
@@ -126,15 +2100,77 @@
   </w:footnote>
   <w:footnote w:type="continuationSeparator" w:id="0">
     <w:p>
-      <w:pPr>
-        <w:spacing w:after="0" w:line="240" w:lineRule="auto"/>
-      </w:pPr>
       <w:r>
         <w:continuationSeparator/>
       </w:r>
     </w:p>
   </w:footnote>
 </w:footnotes>
+</file>
+
+<file path=word/numbering.xml><?xml version="1.0" encoding="utf-8"?>
+<w:numbering xmlns:wpc="http://schemas.microsoft.com/office/word/2010/wordprocessingCanvas" xmlns:cx="http://schemas.microsoft.com/office/drawing/2014/chartex" xmlns:cx1="http://schemas.microsoft.com/office/drawing/2015/9/8/chartex" xmlns:cx2="http://schemas.microsoft.com/office/drawing/2015/10/21/chartex" xmlns:cx3="http://schemas.microsoft.com/office/drawing/2016/5/9/chartex" xmlns:cx4="http://schemas.microsoft.com/office/drawing/2016/5/10/chartex" xmlns:cx5="http://schemas.microsoft.com/office/drawing/2016/5/11/chartex" xmlns:cx6="http://schemas.microsoft.com/office/drawing/2016/5/12/chartex" xmlns:cx7="http://schemas.microsoft.com/office/drawing/2016/5/13/chartex" xmlns:cx8="http://schemas.microsoft.com/office/drawing/2016/5/14/chartex" xmlns:mc="http://schemas.openxmlformats.org/markup-compatibility/2006" xmlns:aink="http://schemas.microsoft.com/office/drawing/2016/ink" xmlns:am3d="http://schemas.microsoft.com/office/drawing/2017/model3d" xmlns:o="urn:schemas-microsoft-com:office:office" xmlns:oel="http://schemas.microsoft.com/office/2019/extlst" xmlns:r="http://schemas.openxmlformats.org/officeDocument/2006/relationships" xmlns:m="http://schemas.openxmlformats.org/officeDocument/2006/math" xmlns:v="urn:schemas-microsoft-com:vml" xmlns:wp14="http://schemas.microsoft.com/office/word/2010/wordprocessingDrawing" xmlns:wp="http://schemas.openxmlformats.org/drawingml/2006/wordprocessingDrawing" xmlns:w10="urn:schemas-microsoft-com:office:word" xmlns:w="http://schemas.openxmlformats.org/wordprocessingml/2006/main" xmlns:w14="http://schemas.microsoft.com/office/word/2010/wordml" xmlns:w15="http://schemas.microsoft.com/office/word/2012/wordml" xmlns:w16cex="http://schemas.microsoft.com/office/word/2018/wordml/cex" xmlns:w16cid="http://schemas.microsoft.com/office/word/2016/wordml/cid" xmlns:w16="http://schemas.microsoft.com/office/word/2018/wordml" xmlns:w16du="http://schemas.microsoft.com/office/word/2023/wordml/word16du" xmlns:w16sdtdh="http://schemas.microsoft.com/office/word/2020/wordml/sdtdatahash" xmlns:w16sdtfl="http://schemas.microsoft.com/office/word/2024/wordml/sdtformatlock" xmlns:w16se="http://schemas.microsoft.com/office/word/2015/wordml/symex" xmlns:wpg="http://schemas.microsoft.com/office/word/2010/wordprocessingGroup" xmlns:wpi="http://schemas.microsoft.com/office/word/2010/wordprocessingInk" xmlns:wne="http://schemas.microsoft.com/office/word/2006/wordml" xmlns:wps="http://schemas.microsoft.com/office/word/2010/wordprocessingShape" mc:Ignorable="w14 w15 w16se w16cid w16 w16cex w16sdtdh w16sdtfl w16du wp14">
+  <w:abstractNum w:abstractNumId="0" w15:restartNumberingAfterBreak="0">
+    <w:nsid w:val="1CEB2CA8"/>
+    <w:multiLevelType w:val="hybridMultilevel"/>
+    <w:tmpl w:val="DAB4D498"/>
+    <w:lvl w:ilvl="0" w:tplc="7E98163A">
+      <w:start w:val="1"/>
+      <w:numFmt w:val="decimal"/>
+      <w:lvlText w:val="%1."/>
+      <w:lvlJc w:val="left"/>
+      <w:pPr>
+        <w:ind w:left="720" w:hanging="360"/>
+      </w:pPr>
+    </w:lvl>
+    <w:lvl w:ilvl="1" w:tplc="2B34E50A">
+      <w:numFmt w:val="decimal"/>
+      <w:lvlText w:val=""/>
+      <w:lvlJc w:val="left"/>
+    </w:lvl>
+    <w:lvl w:ilvl="2" w:tplc="58DA0556">
+      <w:numFmt w:val="decimal"/>
+      <w:lvlText w:val=""/>
+      <w:lvlJc w:val="left"/>
+    </w:lvl>
+    <w:lvl w:ilvl="3" w:tplc="37BCA538">
+      <w:numFmt w:val="decimal"/>
+      <w:lvlText w:val=""/>
+      <w:lvlJc w:val="left"/>
+    </w:lvl>
+    <w:lvl w:ilvl="4" w:tplc="F7CE3E6A">
+      <w:numFmt w:val="decimal"/>
+      <w:lvlText w:val=""/>
+      <w:lvlJc w:val="left"/>
+    </w:lvl>
+    <w:lvl w:ilvl="5" w:tplc="F0E2BE02">
+      <w:numFmt w:val="decimal"/>
+      <w:lvlText w:val=""/>
+      <w:lvlJc w:val="left"/>
+    </w:lvl>
+    <w:lvl w:ilvl="6" w:tplc="F5742378">
+      <w:numFmt w:val="decimal"/>
+      <w:lvlText w:val=""/>
+      <w:lvlJc w:val="left"/>
+    </w:lvl>
+    <w:lvl w:ilvl="7" w:tplc="23583A86">
+      <w:numFmt w:val="decimal"/>
+      <w:lvlText w:val=""/>
+      <w:lvlJc w:val="left"/>
+    </w:lvl>
+    <w:lvl w:ilvl="8" w:tplc="A2168FFC">
+      <w:numFmt w:val="decimal"/>
+      <w:lvlText w:val=""/>
+      <w:lvlJc w:val="left"/>
+    </w:lvl>
+  </w:abstractNum>
+  <w:num w:numId="1" w16cid:durableId="1099182994">
+    <w:abstractNumId w:val="0"/>
+    <w:lvlOverride w:ilvl="0">
+      <w:startOverride w:val="1"/>
+    </w:lvlOverride>
+  </w:num>
+</w:numbering>
 </file>
 
 <file path=word/styles.xml><?xml version="1.0" encoding="utf-8"?>
@@ -336,7 +2372,7 @@
     <w:lsdException w:name="Medium Shading 2 Accent 1" w:uiPriority="64"/>
     <w:lsdException w:name="Medium List 1 Accent 1" w:uiPriority="65"/>
     <w:lsdException w:name="Revision" w:semiHidden="1"/>
-    <w:lsdException w:name="List Paragraph" w:uiPriority="34" w:qFormat="1"/>
+    <w:lsdException w:name="List Paragraph" w:uiPriority="0" w:qFormat="1"/>
     <w:lsdException w:name="Quote" w:uiPriority="29" w:qFormat="1"/>
     <w:lsdException w:name="Intense Quote" w:uiPriority="30" w:qFormat="1"/>
     <w:lsdException w:name="Medium List 2 Accent 1" w:uiPriority="66"/>
@@ -537,6 +2573,18 @@
   <w:style w:type="paragraph" w:default="1" w:styleId="Normal">
     <w:name w:val="Normal"/>
     <w:qFormat/>
+    <w:rsid w:val="00242843"/>
+    <w:pPr>
+      <w:spacing w:after="0" w:line="240" w:lineRule="auto"/>
+    </w:pPr>
+    <w:rPr>
+      <w:rFonts w:ascii="Times New Roman" w:eastAsia="Times New Roman" w:hAnsi="Times New Roman" w:cs="Times New Roman"/>
+      <w:kern w:val="0"/>
+      <w:sz w:val="20"/>
+      <w:szCs w:val="20"/>
+      <w:lang w:val="en-HK" w:eastAsia="en-HK"/>
+      <w14:ligatures w14:val="none"/>
+    </w:rPr>
   </w:style>
   <w:style w:type="paragraph" w:styleId="Heading1">
     <w:name w:val="heading 1"/>
@@ -662,7 +2710,7 @@
     <w:pPr>
       <w:keepNext/>
       <w:keepLines/>
-      <w:spacing w:before="40" w:after="0"/>
+      <w:spacing w:before="40"/>
       <w:outlineLvl w:val="5"/>
     </w:pPr>
     <w:rPr>
@@ -685,7 +2733,7 @@
     <w:pPr>
       <w:keepNext/>
       <w:keepLines/>
-      <w:spacing w:before="40" w:after="0"/>
+      <w:spacing w:before="40"/>
       <w:outlineLvl w:val="6"/>
     </w:pPr>
     <w:rPr>
@@ -706,7 +2754,6 @@
     <w:pPr>
       <w:keepNext/>
       <w:keepLines/>
-      <w:spacing w:after="0"/>
       <w:outlineLvl w:val="7"/>
     </w:pPr>
     <w:rPr>
@@ -729,7 +2776,6 @@
     <w:pPr>
       <w:keepNext/>
       <w:keepLines/>
-      <w:spacing w:after="0"/>
       <w:outlineLvl w:val="8"/>
     </w:pPr>
     <w:rPr>
@@ -892,7 +2938,7 @@
     <w:qFormat/>
     <w:rsid w:val="00D778AF"/>
     <w:pPr>
-      <w:spacing w:after="80" w:line="240" w:lineRule="auto"/>
+      <w:spacing w:after="80"/>
       <w:contextualSpacing/>
     </w:pPr>
     <w:rPr>
@@ -985,7 +3031,6 @@
   <w:style w:type="paragraph" w:styleId="ListParagraph">
     <w:name w:val="List Paragraph"/>
     <w:basedOn w:val="Normal"/>
-    <w:uiPriority w:val="34"/>
     <w:qFormat/>
     <w:rsid w:val="00D778AF"/>
     <w:pPr>
@@ -1066,7 +3111,6 @@
         <w:tab w:val="center" w:pos="4680"/>
         <w:tab w:val="right" w:pos="9360"/>
       </w:tabs>
-      <w:spacing w:after="0" w:line="240" w:lineRule="auto"/>
     </w:pPr>
   </w:style>
   <w:style w:type="character" w:customStyle="1" w:styleId="HeaderChar">
@@ -1088,7 +3132,6 @@
         <w:tab w:val="center" w:pos="4680"/>
         <w:tab w:val="right" w:pos="9360"/>
       </w:tabs>
-      <w:spacing w:after="0" w:line="240" w:lineRule="auto"/>
     </w:pPr>
   </w:style>
   <w:style w:type="character" w:customStyle="1" w:styleId="FooterChar">

</xml_diff>

<commit_message>
Formatting Changes Chapter 1
</commit_message>
<xml_diff>
--- a/01_THESIS/Chapter 1/Chapter 1 Master.docx
+++ b/01_THESIS/Chapter 1/Chapter 1 Master.docx
@@ -11008,8 +11008,8 @@
     <w:p>
       <w:pPr>
         <w:pStyle w:val="BodyText"/>
-        <w:spacing w:before="60" w:line="480" w:lineRule="auto"/>
-        <w:ind w:right="352" w:firstLine="720"/>
+        <w:spacing w:line="480" w:lineRule="auto"/>
+        <w:ind w:firstLine="720"/>
       </w:pPr>
       <w:r>
         <w:lastRenderedPageBreak/>
@@ -11136,7 +11136,7 @@
       <w:pPr>
         <w:pStyle w:val="BodyText"/>
         <w:spacing w:line="480" w:lineRule="auto"/>
-        <w:ind w:right="367" w:firstLine="720"/>
+        <w:ind w:firstLine="720"/>
       </w:pPr>
       <w:r>
         <w:t>The</w:t>

</xml_diff>

<commit_message>
Chapter 1 removed API
</commit_message>
<xml_diff>
--- a/01_THESIS/Chapter 1/Chapter 1 Master.docx
+++ b/01_THESIS/Chapter 1/Chapter 1 Master.docx
@@ -10733,7 +10733,10 @@
         <w:ind w:right="366" w:firstLine="720"/>
       </w:pPr>
       <w:r>
-        <w:t>The study additionally explores an Online Code Compiler and an external API and data architecture as proposed, stretch-level directions; these are intended to support programming-related assessments and integration with external learning platforms, respectively, but remain subject to the project team's final approved scope and are not treated as guaranteed core deliverables of this study.</w:t>
+        <w:t>The study additionally explores an Online Code Compiler and an external API and data architecture as proposed, stretch-level directions; these are intended to support programming-related assessments and integration with external learning platforms</w:t>
+      </w:r>
+      <w:r>
+        <w:t>.</w:t>
       </w:r>
     </w:p>
     <w:p>

</xml_diff>

<commit_message>
Updated c1 and c2 to match the new title AGORA
</commit_message>
<xml_diff>
--- a/01_THESIS/Chapter 1/Chapter 1 Master.docx
+++ b/01_THESIS/Chapter 1/Chapter 1 Master.docx
@@ -10,7 +10,6 @@
           <w:szCs w:val="24"/>
         </w:rPr>
       </w:pPr>
-      <w:proofErr w:type="spellStart"/>
       <w:r>
         <w:rPr>
           <w:b/>
@@ -19,18 +18,7 @@
           <w:sz w:val="24"/>
           <w:szCs w:val="24"/>
         </w:rPr>
-        <w:t>ACTSight</w:t>
-      </w:r>
-      <w:proofErr w:type="spellEnd"/>
-      <w:r>
-        <w:rPr>
-          <w:b/>
-          <w:bCs/>
-          <w:color w:val="000000"/>
-          <w:sz w:val="24"/>
-          <w:szCs w:val="24"/>
-        </w:rPr>
-        <w:t>: An OCR-Based Automated Assessment and Agentic Console for Quiz Automation, AI-Assisted Learning Plan Generation, and Student Retention Analytics </w:t>
+        <w:t>AGORA - Agent Generator and OCR-based Recognition Assistant for Quiz Automation, AI-Assisted Learning Plan Generation, and Student Retention Analytics</w:t>
       </w:r>
     </w:p>
     <w:p>
@@ -1358,80 +1346,114 @@
         </w:rPr>
         <w:t xml:space="preserve"> </w:t>
       </w:r>
-      <w:proofErr w:type="spellStart"/>
-      <w:r>
-        <w:t>ACTSight</w:t>
-      </w:r>
-      <w:proofErr w:type="spellEnd"/>
-      <w:r>
-        <w:t>:</w:t>
-      </w:r>
-      <w:r>
-        <w:rPr>
-          <w:spacing w:val="-12"/>
-        </w:rPr>
-        <w:t xml:space="preserve"> </w:t>
-      </w:r>
-      <w:r>
-        <w:t>An</w:t>
-      </w:r>
-      <w:r>
-        <w:rPr>
-          <w:spacing w:val="-11"/>
-        </w:rPr>
-        <w:t xml:space="preserve"> </w:t>
-      </w:r>
-      <w:r>
-        <w:t>OCR-Based</w:t>
-      </w:r>
-      <w:r>
-        <w:rPr>
-          <w:spacing w:val="-12"/>
-        </w:rPr>
-        <w:t xml:space="preserve"> </w:t>
-      </w:r>
-      <w:r>
-        <w:t>Automated</w:t>
-      </w:r>
-      <w:r>
-        <w:rPr>
-          <w:spacing w:val="-11"/>
-        </w:rPr>
-        <w:t xml:space="preserve"> </w:t>
-      </w:r>
-      <w:r>
-        <w:t>Assessment</w:t>
-      </w:r>
-      <w:r>
-        <w:rPr>
-          <w:spacing w:val="-12"/>
-        </w:rPr>
-        <w:t xml:space="preserve"> </w:t>
-      </w:r>
-      <w:r>
-        <w:t>and</w:t>
-      </w:r>
-      <w:r>
-        <w:rPr>
-          <w:spacing w:val="-11"/>
-        </w:rPr>
-        <w:t xml:space="preserve"> </w:t>
-      </w:r>
-      <w:r>
-        <w:t>Agentic</w:t>
-      </w:r>
-      <w:r>
-        <w:rPr>
-          <w:spacing w:val="-11"/>
-        </w:rPr>
-        <w:t xml:space="preserve"> </w:t>
-      </w:r>
-      <w:r>
-        <w:t>Console</w:t>
-      </w:r>
-      <w:r>
-        <w:rPr>
-          <w:spacing w:val="-12"/>
+      <w:r>
+        <w:t>AGORA - Agent Generator and OCR-based Recognition Assistant for Quiz Automation, AI-Assisted Learning Plan Generation, and Student Retention Analytics</w:t>
+      </w:r>
+      <w:r>
+        <w:t>,</w:t>
+      </w:r>
+      <w:r>
+        <w:rPr>
+          <w:spacing w:val="-3"/>
+        </w:rPr>
+        <w:t xml:space="preserve"> </w:t>
+      </w:r>
+      <w:r>
+        <w:t>a</w:t>
+      </w:r>
+      <w:r>
+        <w:rPr>
+          <w:spacing w:val="-3"/>
+        </w:rPr>
+        <w:t xml:space="preserve"> </w:t>
+      </w:r>
+      <w:r>
+        <w:t>proposed web-based</w:t>
+      </w:r>
+      <w:r>
+        <w:rPr>
+          <w:spacing w:val="-5"/>
+        </w:rPr>
+        <w:t xml:space="preserve"> </w:t>
+      </w:r>
+      <w:r>
+        <w:t>educational</w:t>
+      </w:r>
+      <w:r>
+        <w:rPr>
+          <w:spacing w:val="-6"/>
+        </w:rPr>
+        <w:t xml:space="preserve"> </w:t>
+      </w:r>
+      <w:r>
+        <w:t>system</w:t>
+      </w:r>
+      <w:r>
+        <w:rPr>
+          <w:spacing w:val="-6"/>
+        </w:rPr>
+        <w:t xml:space="preserve"> </w:t>
+      </w:r>
+      <w:r>
+        <w:t>that</w:t>
+      </w:r>
+      <w:r>
+        <w:rPr>
+          <w:spacing w:val="-6"/>
+        </w:rPr>
+        <w:t xml:space="preserve"> </w:t>
+      </w:r>
+      <w:r>
+        <w:t>unifies</w:t>
+      </w:r>
+      <w:r>
+        <w:rPr>
+          <w:spacing w:val="-5"/>
+        </w:rPr>
+        <w:t xml:space="preserve"> </w:t>
+      </w:r>
+      <w:r>
+        <w:t>assessment</w:t>
+      </w:r>
+      <w:r>
+        <w:rPr>
+          <w:spacing w:val="-6"/>
+        </w:rPr>
+        <w:t xml:space="preserve"> </w:t>
+      </w:r>
+      <w:r>
+        <w:t>processing,</w:t>
+      </w:r>
+      <w:r>
+        <w:rPr>
+          <w:spacing w:val="-5"/>
+        </w:rPr>
+        <w:t xml:space="preserve"> </w:t>
+      </w:r>
+      <w:r>
+        <w:t>an</w:t>
+      </w:r>
+      <w:r>
+        <w:rPr>
+          <w:spacing w:val="-5"/>
+        </w:rPr>
+        <w:t xml:space="preserve"> </w:t>
+      </w:r>
+      <w:r>
+        <w:t>agentic</w:t>
+      </w:r>
+      <w:r>
+        <w:rPr>
+          <w:spacing w:val="-6"/>
+        </w:rPr>
+        <w:t xml:space="preserve"> </w:t>
+      </w:r>
+      <w:r>
+        <w:t>console</w:t>
+      </w:r>
+      <w:r>
+        <w:rPr>
+          <w:spacing w:val="-6"/>
         </w:rPr>
         <w:t xml:space="preserve"> </w:t>
       </w:r>
@@ -1440,111 +1462,12 @@
       </w:r>
       <w:r>
         <w:rPr>
-          <w:spacing w:val="-11"/>
-        </w:rPr>
-        <w:t xml:space="preserve"> </w:t>
-      </w:r>
-      <w:r>
-        <w:t>Quiz Automation,</w:t>
-      </w:r>
-      <w:r>
-        <w:rPr>
-          <w:spacing w:val="-3"/>
-        </w:rPr>
-        <w:t xml:space="preserve"> </w:t>
-      </w:r>
-      <w:r>
-        <w:t>AI-Assisted</w:t>
-      </w:r>
-      <w:r>
-        <w:rPr>
-          <w:spacing w:val="-3"/>
-        </w:rPr>
-        <w:t xml:space="preserve"> </w:t>
-      </w:r>
-      <w:r>
-        <w:t>Learning</w:t>
-      </w:r>
-      <w:r>
-        <w:rPr>
-          <w:spacing w:val="-3"/>
-        </w:rPr>
-        <w:t xml:space="preserve"> </w:t>
-      </w:r>
-      <w:r>
-        <w:t>Plan</w:t>
-      </w:r>
-      <w:r>
-        <w:rPr>
-          <w:spacing w:val="-3"/>
-        </w:rPr>
-        <w:t xml:space="preserve"> </w:t>
-      </w:r>
-      <w:r>
-        <w:t>Generation,</w:t>
-      </w:r>
-      <w:r>
-        <w:rPr>
-          <w:spacing w:val="-3"/>
-        </w:rPr>
-        <w:t xml:space="preserve"> </w:t>
-      </w:r>
-      <w:r>
-        <w:t>and</w:t>
-      </w:r>
-      <w:r>
-        <w:rPr>
-          <w:spacing w:val="-3"/>
-        </w:rPr>
-        <w:t xml:space="preserve"> </w:t>
-      </w:r>
-      <w:r>
-        <w:t>Student</w:t>
-      </w:r>
-      <w:r>
-        <w:rPr>
-          <w:spacing w:val="-3"/>
-        </w:rPr>
-        <w:t xml:space="preserve"> </w:t>
-      </w:r>
-      <w:r>
-        <w:t>Retention</w:t>
-      </w:r>
-      <w:r>
-        <w:rPr>
-          <w:spacing w:val="-3"/>
-        </w:rPr>
-        <w:t xml:space="preserve"> </w:t>
-      </w:r>
-      <w:r>
-        <w:t>Analytics,</w:t>
-      </w:r>
-      <w:r>
-        <w:rPr>
-          <w:spacing w:val="-3"/>
-        </w:rPr>
-        <w:t xml:space="preserve"> </w:t>
-      </w:r>
-      <w:r>
-        <w:t>a</w:t>
-      </w:r>
-      <w:r>
-        <w:rPr>
-          <w:spacing w:val="-3"/>
-        </w:rPr>
-        <w:t xml:space="preserve"> </w:t>
-      </w:r>
-      <w:r>
-        <w:t>proposed web-based</w:t>
-      </w:r>
-      <w:r>
-        <w:rPr>
           <w:spacing w:val="-5"/>
         </w:rPr>
         <w:t xml:space="preserve"> </w:t>
       </w:r>
       <w:r>
-        <w:t>educational</w:t>
+        <w:t>quiz</w:t>
       </w:r>
       <w:r>
         <w:rPr>
@@ -1553,103 +1476,11 @@
         <w:t xml:space="preserve"> </w:t>
       </w:r>
       <w:r>
-        <w:t>system</w:t>
-      </w:r>
-      <w:r>
-        <w:rPr>
-          <w:spacing w:val="-6"/>
-        </w:rPr>
-        <w:t xml:space="preserve"> </w:t>
-      </w:r>
-      <w:r>
-        <w:t>that</w:t>
-      </w:r>
-      <w:r>
-        <w:rPr>
-          <w:spacing w:val="-6"/>
-        </w:rPr>
-        <w:t xml:space="preserve"> </w:t>
-      </w:r>
-      <w:r>
-        <w:t>unifies</w:t>
-      </w:r>
-      <w:r>
-        <w:rPr>
-          <w:spacing w:val="-5"/>
-        </w:rPr>
-        <w:t xml:space="preserve"> </w:t>
-      </w:r>
-      <w:r>
-        <w:t>assessment</w:t>
-      </w:r>
-      <w:r>
-        <w:rPr>
-          <w:spacing w:val="-6"/>
-        </w:rPr>
-        <w:t xml:space="preserve"> </w:t>
-      </w:r>
-      <w:r>
-        <w:t>processing,</w:t>
-      </w:r>
-      <w:r>
-        <w:rPr>
-          <w:spacing w:val="-5"/>
-        </w:rPr>
-        <w:t xml:space="preserve"> </w:t>
-      </w:r>
-      <w:r>
-        <w:t>an</w:t>
-      </w:r>
-      <w:r>
-        <w:rPr>
-          <w:spacing w:val="-5"/>
-        </w:rPr>
-        <w:t xml:space="preserve"> </w:t>
-      </w:r>
-      <w:r>
-        <w:t>agentic</w:t>
-      </w:r>
-      <w:r>
-        <w:rPr>
-          <w:spacing w:val="-6"/>
-        </w:rPr>
-        <w:t xml:space="preserve"> </w:t>
-      </w:r>
-      <w:r>
-        <w:t>console</w:t>
-      </w:r>
-      <w:r>
-        <w:rPr>
-          <w:spacing w:val="-6"/>
-        </w:rPr>
-        <w:t xml:space="preserve"> </w:t>
-      </w:r>
-      <w:r>
-        <w:t>for</w:t>
-      </w:r>
-      <w:r>
-        <w:rPr>
-          <w:spacing w:val="-5"/>
-        </w:rPr>
-        <w:t xml:space="preserve"> </w:t>
-      </w:r>
-      <w:r>
-        <w:t>quiz</w:t>
-      </w:r>
-      <w:r>
-        <w:rPr>
-          <w:spacing w:val="-6"/>
-        </w:rPr>
-        <w:t xml:space="preserve"> </w:t>
-      </w:r>
-      <w:r>
         <w:t xml:space="preserve">and instructional-content generation, and retention analytics within a single platform. While ACTS Computer College serves as the research setting for this study, </w:t>
       </w:r>
-      <w:proofErr w:type="spellStart"/>
-      <w:r>
-        <w:t>ACTSight</w:t>
-      </w:r>
-      <w:proofErr w:type="spellEnd"/>
+      <w:r>
+        <w:t>AGORA</w:t>
+      </w:r>
       <w:r>
         <w:t xml:space="preserve"> is designed as a system</w:t>
       </w:r>
@@ -1706,14 +1537,6 @@
     </w:p>
     <w:p>
       <w:pPr>
-        <w:rPr>
-          <w:sz w:val="24"/>
-          <w:szCs w:val="24"/>
-        </w:rPr>
-      </w:pPr>
-    </w:p>
-    <w:p>
-      <w:pPr>
         <w:pStyle w:val="BodyText"/>
         <w:spacing w:line="480" w:lineRule="auto"/>
         <w:ind w:right="352" w:firstLine="720"/>
@@ -2748,13 +2571,11 @@
       <w:r>
         <w:t xml:space="preserve">To address these concerns, this study proposes the development of </w:t>
       </w:r>
-      <w:proofErr w:type="spellStart"/>
-      <w:r>
-        <w:t>ACTSight</w:t>
-      </w:r>
-      <w:proofErr w:type="spellEnd"/>
-      <w:r>
-        <w:t>: An OCR-Based Automated Assessment and Agentic Console for Quiz Automation, AI-Assisted Learning Plan Generation, and Student Retention Analytics. For the purposes of this research, ACTS Computer College serves as the primary research setting and institutional context, providing a localized</w:t>
+      <w:r>
+        <w:t>AGORA - Agent Generator and OCR-based Recognition Assistant for Quiz Automation, AI-Assisted Learning Plan Generation, and Student Retention Analytics</w:t>
+      </w:r>
+      <w:r>
+        <w:t>. For the purposes of this research, ACTS Computer College serves as the primary research setting and institutional context, providing a localized</w:t>
       </w:r>
       <w:r>
         <w:rPr>
@@ -2825,11 +2646,9 @@
         </w:rPr>
         <w:t xml:space="preserve"> </w:t>
       </w:r>
-      <w:proofErr w:type="spellStart"/>
-      <w:r>
-        <w:t>ACTSight</w:t>
-      </w:r>
-      <w:proofErr w:type="spellEnd"/>
+      <w:r>
+        <w:t>AGORA</w:t>
+      </w:r>
       <w:r>
         <w:t>,</w:t>
       </w:r>
@@ -2985,13 +2804,11 @@
         </w:rPr>
         <w:t xml:space="preserve"> </w:t>
       </w:r>
-      <w:proofErr w:type="spellStart"/>
-      <w:r>
-        <w:t>ACTSight</w:t>
-      </w:r>
-      <w:proofErr w:type="spellEnd"/>
-      <w:r>
-        <w:t>:</w:t>
+      <w:r>
+        <w:t>AGORA - Agent Generator and OCR-based Recognition Assistant for Quiz Automation, AI-Assisted Learning Plan Generation, and Student Retention Analytics</w:t>
+      </w:r>
+      <w:r>
+        <w:t>, a proposed web-based educational system designed for institutions, administrators,</w:t>
       </w:r>
       <w:r>
         <w:rPr>
@@ -3000,7 +2817,7 @@
         <w:t xml:space="preserve"> </w:t>
       </w:r>
       <w:r>
-        <w:t>An</w:t>
+        <w:t>teachers,</w:t>
       </w:r>
       <w:r>
         <w:rPr>
@@ -3009,7 +2826,7 @@
         <w:t xml:space="preserve"> </w:t>
       </w:r>
       <w:r>
-        <w:t>OCR-Based</w:t>
+        <w:t>and</w:t>
       </w:r>
       <w:r>
         <w:rPr>
@@ -3018,7 +2835,7 @@
         <w:t xml:space="preserve"> </w:t>
       </w:r>
       <w:r>
-        <w:t>Automated</w:t>
+        <w:t>students,</w:t>
       </w:r>
       <w:r>
         <w:rPr>
@@ -3027,7 +2844,7 @@
         <w:t xml:space="preserve"> </w:t>
       </w:r>
       <w:r>
-        <w:t>Assessment and Agentic Console for Quiz Automation, AI-Assisted Learning Plan Generation, and Student Retention Analytics, a proposed web-based educational system designed for institutions, administrators,</w:t>
+        <w:t>with</w:t>
       </w:r>
       <w:r>
         <w:rPr>
@@ -3036,7 +2853,7 @@
         <w:t xml:space="preserve"> </w:t>
       </w:r>
       <w:r>
-        <w:t>teachers,</w:t>
+        <w:t>functions</w:t>
       </w:r>
       <w:r>
         <w:rPr>
@@ -3054,7 +2871,7 @@
         <w:t xml:space="preserve"> </w:t>
       </w:r>
       <w:r>
-        <w:t>students,</w:t>
+        <w:t>access</w:t>
       </w:r>
       <w:r>
         <w:rPr>
@@ -3063,7 +2880,7 @@
         <w:t xml:space="preserve"> </w:t>
       </w:r>
       <w:r>
-        <w:t>with</w:t>
+        <w:t>permissions</w:t>
       </w:r>
       <w:r>
         <w:rPr>
@@ -3072,7 +2889,7 @@
         <w:t xml:space="preserve"> </w:t>
       </w:r>
       <w:r>
-        <w:t>functions</w:t>
+        <w:t>based</w:t>
       </w:r>
       <w:r>
         <w:rPr>
@@ -3081,7 +2898,7 @@
         <w:t xml:space="preserve"> </w:t>
       </w:r>
       <w:r>
-        <w:t>and</w:t>
+        <w:t>on</w:t>
       </w:r>
       <w:r>
         <w:rPr>
@@ -3090,7 +2907,7 @@
         <w:t xml:space="preserve"> </w:t>
       </w:r>
       <w:r>
-        <w:t>access</w:t>
+        <w:t>each</w:t>
       </w:r>
       <w:r>
         <w:rPr>
@@ -3099,49 +2916,11 @@
         <w:t xml:space="preserve"> </w:t>
       </w:r>
       <w:r>
-        <w:t>permissions</w:t>
-      </w:r>
-      <w:r>
-        <w:rPr>
-          <w:spacing w:val="-5"/>
-        </w:rPr>
-        <w:t xml:space="preserve"> </w:t>
-      </w:r>
-      <w:r>
-        <w:t>based</w:t>
-      </w:r>
-      <w:r>
-        <w:rPr>
-          <w:spacing w:val="-5"/>
-        </w:rPr>
-        <w:t xml:space="preserve"> </w:t>
-      </w:r>
-      <w:r>
-        <w:t>on</w:t>
-      </w:r>
-      <w:r>
-        <w:rPr>
-          <w:spacing w:val="-5"/>
-        </w:rPr>
-        <w:t xml:space="preserve"> </w:t>
-      </w:r>
-      <w:r>
-        <w:t>each</w:t>
-      </w:r>
-      <w:r>
-        <w:rPr>
-          <w:spacing w:val="-5"/>
-        </w:rPr>
-        <w:t xml:space="preserve"> </w:t>
-      </w:r>
-      <w:r>
         <w:t xml:space="preserve">user's assigned role. </w:t>
       </w:r>
-      <w:proofErr w:type="spellStart"/>
-      <w:r>
-        <w:t>ACTSight</w:t>
-      </w:r>
-      <w:proofErr w:type="spellEnd"/>
+      <w:r>
+        <w:t>AGORA</w:t>
+      </w:r>
       <w:r>
         <w:t xml:space="preserve"> aims to address instructional and administrative tasks that may require significant manual work, particularly the checking of physical and digital assessments, the processing of objective and written responses, the generation of quizzes and instructional materials,</w:t>
       </w:r>
@@ -3374,11 +3153,9 @@
       <w:r>
         <w:t xml:space="preserve">recognition (OCR), natural language processing, machine learning, and agentic AI concepts within a single system blueprint. </w:t>
       </w:r>
-      <w:proofErr w:type="spellStart"/>
-      <w:r>
-        <w:t>ACTSight</w:t>
-      </w:r>
-      <w:proofErr w:type="spellEnd"/>
+      <w:r>
+        <w:t>AGORA</w:t>
+      </w:r>
       <w:r>
         <w:t xml:space="preserve"> is not intended to replace teachers' final decisions; where automated processing</w:t>
       </w:r>
@@ -3750,15 +3527,7 @@
         <w:t xml:space="preserve"> </w:t>
       </w:r>
       <w:r>
-        <w:t>tasks such as quiz generation, quiz dissemination, and the retrieval of class performance information, without requiring the teacher to construct technical AI prompts. The ACTS Notebook is an AI-assisted instructional planning component that generates a structured lecture or discussion, organized into sections such as topic, learning objective, lecture or discussion, assessment, and resources, based on the teacher's weekly detailed plan and related learning resources. The E-</w:t>
-      </w:r>
-      <w:proofErr w:type="spellStart"/>
-      <w:r>
-        <w:t>Classrecord</w:t>
-      </w:r>
-      <w:proofErr w:type="spellEnd"/>
-      <w:r>
-        <w:t xml:space="preserve"> is a pre-formatted, landscape-oriented Excel-based academic record that allows teachers to organize assessment components, assign assessment weights, associate assessments with the</w:t>
+        <w:t>tasks such as quiz generation, quiz dissemination, and the retrieval of class performance information, without requiring the teacher to construct technical AI prompts. The ACTS Notebook is an AI-assisted instructional planning component that generates a structured lecture or discussion, organized into sections such as topic, learning objective, lecture or discussion, assessment, and resources, based on the teacher's weekly detailed plan and related learning resources. The E-Classrecord is a pre-formatted, landscape-oriented Excel-based academic record that allows teachers to organize assessment components, assign assessment weights, associate assessments with the</w:t>
       </w:r>
       <w:r>
         <w:rPr>
@@ -4464,11 +4233,9 @@
         <w:spacing w:line="480" w:lineRule="auto"/>
         <w:ind w:right="348" w:firstLine="720"/>
       </w:pPr>
-      <w:proofErr w:type="spellStart"/>
-      <w:r>
-        <w:t>ACTSight</w:t>
-      </w:r>
-      <w:proofErr w:type="spellEnd"/>
+      <w:r>
+        <w:t>AGORA</w:t>
+      </w:r>
       <w:r>
         <w:t xml:space="preserve"> is intended primarily for four types of users, each with defined functions and access</w:t>
       </w:r>
@@ -4668,15 +4435,7 @@
         <w:t xml:space="preserve"> </w:t>
       </w:r>
       <w:r>
-        <w:t>classes, and managing the school's timeline and grading periods. The Teacher is the primary user of the instructional and assessment-management functions and may use the ACTS Agent Console, the ACTS Notebook, the AI-Assisted Assessment Checker, the E-</w:t>
-      </w:r>
-      <w:proofErr w:type="spellStart"/>
-      <w:r>
-        <w:t>Classrecord</w:t>
-      </w:r>
-      <w:proofErr w:type="spellEnd"/>
-      <w:r>
-        <w:t>, performance monitoring, the review or correction of uncertain automated results, and the uploading of student rosters</w:t>
+        <w:t>classes, and managing the school's timeline and grading periods. The Teacher is the primary user of the instructional and assessment-management functions and may use the ACTS Agent Console, the ACTS Notebook, the AI-Assisted Assessment Checker, the E-Classrecord, performance monitoring, the review or correction of uncertain automated results, and the uploading of student rosters</w:t>
       </w:r>
       <w:r>
         <w:rPr>
@@ -4783,11 +4542,9 @@
         </w:rPr>
         <w:t xml:space="preserve"> </w:t>
       </w:r>
-      <w:proofErr w:type="gramStart"/>
       <w:r>
         <w:t>Student</w:t>
       </w:r>
-      <w:proofErr w:type="gramEnd"/>
       <w:r>
         <w:rPr>
           <w:spacing w:val="-11"/>
@@ -5507,13 +5264,11 @@
       <w:r>
         <w:t xml:space="preserve">criteria, monitoring student attendance and assessment performance, and identifying students who may require additional attention based on available academic indicators. Because these tasks are performed largely by hand, teachers may need to devote significant time and effort to routine assessment and record-keeping work, which can reduce the time available for instructional planning and direct student support. To help address these concerns, this study proposes </w:t>
       </w:r>
-      <w:proofErr w:type="spellStart"/>
-      <w:r>
-        <w:t>ACTSight</w:t>
-      </w:r>
-      <w:proofErr w:type="spellEnd"/>
-      <w:r>
-        <w:t>: An OCR-Based Automated Assessment and Agentic Console for Quiz Automation, AI-Assisted Learning Plan Generation, and Student Retention Analytics, a proposed web-based educational system that combines optical character recognition (OCR), AI-assisted instructional content</w:t>
+      <w:r>
+        <w:t>AGORA - Agent Generator and OCR-based Recognition Assistant for Quiz Automation, AI-Assisted Learning Plan Generation, and Student Retention Analytics</w:t>
+      </w:r>
+      <w:r>
+        <w:t>, a proposed web-based educational system that combines optical character recognition (OCR), AI-assisted instructional content</w:t>
       </w:r>
       <w:r>
         <w:rPr>
@@ -5730,19 +5485,17 @@
         </w:rPr>
         <w:t xml:space="preserve">Design and Develop </w:t>
       </w:r>
-      <w:proofErr w:type="spellStart"/>
-      <w:r>
-        <w:rPr>
-          <w:sz w:val="24"/>
-        </w:rPr>
-        <w:t>ACTSight</w:t>
-      </w:r>
-      <w:proofErr w:type="spellEnd"/>
-      <w:r>
-        <w:rPr>
-          <w:sz w:val="24"/>
-        </w:rPr>
-        <w:t>: An OCR-Based Automated Assessment and Agentic Console for Quiz Automation, AI-Assisted Learning Plan Generation, and Student Retention Analytics:</w:t>
+      <w:r>
+        <w:rPr>
+          <w:sz w:val="24"/>
+        </w:rPr>
+        <w:t>AGORA - Agent Generator and OCR-based Recognition Assistant for Quiz Automation, AI-Assisted Learning Plan Generation, and Student Retention Analytics</w:t>
+      </w:r>
+      <w:r>
+        <w:rPr>
+          <w:sz w:val="24"/>
+        </w:rPr>
+        <w:t>:</w:t>
       </w:r>
     </w:p>
     <w:p>
@@ -5787,14 +5540,12 @@
         <w:lastRenderedPageBreak/>
         <w:t xml:space="preserve">What role-based access and functions does the proposed </w:t>
       </w:r>
-      <w:proofErr w:type="spellStart"/>
-      <w:r>
-        <w:rPr>
-          <w:sz w:val="24"/>
-        </w:rPr>
-        <w:t>ACTSight</w:t>
-      </w:r>
-      <w:proofErr w:type="spellEnd"/>
+      <w:r>
+        <w:rPr>
+          <w:sz w:val="24"/>
+        </w:rPr>
+        <w:t>AGORA</w:t>
+      </w:r>
       <w:r>
         <w:rPr>
           <w:sz w:val="24"/>
@@ -6492,21 +6243,7 @@
         <w:rPr>
           <w:sz w:val="24"/>
         </w:rPr>
-        <w:t>How does the E-</w:t>
-      </w:r>
-      <w:proofErr w:type="spellStart"/>
-      <w:r>
-        <w:rPr>
-          <w:sz w:val="24"/>
-        </w:rPr>
-        <w:t>Classrecord</w:t>
-      </w:r>
-      <w:proofErr w:type="spellEnd"/>
-      <w:r>
-        <w:rPr>
-          <w:sz w:val="24"/>
-        </w:rPr>
-        <w:t xml:space="preserve"> help teachers organize assessment components, assign assessment weights, and compute grades according to the corresponding grading period?</w:t>
+        <w:t>How does the E-Classrecord help teachers organize assessment components, assign assessment weights, and compute grades according to the corresponding grading period?</w:t>
       </w:r>
     </w:p>
     <w:p>
@@ -6827,14 +6564,12 @@
         </w:rPr>
         <w:t xml:space="preserve"> </w:t>
       </w:r>
-      <w:proofErr w:type="spellStart"/>
-      <w:r>
-        <w:rPr>
-          <w:sz w:val="24"/>
-        </w:rPr>
-        <w:t>ACTSight</w:t>
-      </w:r>
-      <w:proofErr w:type="spellEnd"/>
+      <w:r>
+        <w:rPr>
+          <w:sz w:val="24"/>
+        </w:rPr>
+        <w:t>AGORA</w:t>
+      </w:r>
       <w:r>
         <w:rPr>
           <w:spacing w:val="-15"/>
@@ -6917,149 +6652,17 @@
         <w:lastRenderedPageBreak/>
         <w:t xml:space="preserve">Determine the acceptability of </w:t>
       </w:r>
-      <w:proofErr w:type="spellStart"/>
-      <w:r>
-        <w:rPr>
-          <w:sz w:val="24"/>
-        </w:rPr>
-        <w:t>ACTSight</w:t>
-      </w:r>
-      <w:proofErr w:type="spellEnd"/>
-      <w:r>
-        <w:rPr>
-          <w:sz w:val="24"/>
-        </w:rPr>
-        <w:t>: An OCR-Based Automated Assessment and Agentic</w:t>
-      </w:r>
-      <w:r>
-        <w:rPr>
-          <w:spacing w:val="-15"/>
-          <w:sz w:val="24"/>
-        </w:rPr>
-        <w:t xml:space="preserve"> </w:t>
-      </w:r>
-      <w:r>
-        <w:rPr>
-          <w:sz w:val="24"/>
-        </w:rPr>
-        <w:t>Console</w:t>
-      </w:r>
-      <w:r>
-        <w:rPr>
-          <w:spacing w:val="-15"/>
-          <w:sz w:val="24"/>
-        </w:rPr>
-        <w:t xml:space="preserve"> </w:t>
-      </w:r>
-      <w:r>
-        <w:rPr>
-          <w:sz w:val="24"/>
-        </w:rPr>
-        <w:t>for</w:t>
-      </w:r>
-      <w:r>
-        <w:rPr>
-          <w:spacing w:val="-15"/>
-          <w:sz w:val="24"/>
-        </w:rPr>
-        <w:t xml:space="preserve"> </w:t>
-      </w:r>
-      <w:r>
-        <w:rPr>
-          <w:sz w:val="24"/>
-        </w:rPr>
-        <w:t>Quiz</w:t>
-      </w:r>
-      <w:r>
-        <w:rPr>
-          <w:spacing w:val="-15"/>
-          <w:sz w:val="24"/>
-        </w:rPr>
-        <w:t xml:space="preserve"> </w:t>
-      </w:r>
-      <w:r>
-        <w:rPr>
-          <w:sz w:val="24"/>
-        </w:rPr>
-        <w:t>Automation,</w:t>
-      </w:r>
-      <w:r>
-        <w:rPr>
-          <w:spacing w:val="-15"/>
-          <w:sz w:val="24"/>
-        </w:rPr>
-        <w:t xml:space="preserve"> </w:t>
-      </w:r>
-      <w:r>
-        <w:rPr>
-          <w:sz w:val="24"/>
-        </w:rPr>
-        <w:t>AI-Assisted</w:t>
-      </w:r>
-      <w:r>
-        <w:rPr>
-          <w:spacing w:val="-15"/>
-          <w:sz w:val="24"/>
-        </w:rPr>
-        <w:t xml:space="preserve"> </w:t>
-      </w:r>
-      <w:r>
-        <w:rPr>
-          <w:sz w:val="24"/>
-        </w:rPr>
-        <w:t>Learning</w:t>
-      </w:r>
-      <w:r>
-        <w:rPr>
-          <w:spacing w:val="-15"/>
-          <w:sz w:val="24"/>
-        </w:rPr>
-        <w:t xml:space="preserve"> </w:t>
-      </w:r>
-      <w:r>
-        <w:rPr>
-          <w:sz w:val="24"/>
-        </w:rPr>
-        <w:t>Plan</w:t>
-      </w:r>
-      <w:r>
-        <w:rPr>
-          <w:spacing w:val="-15"/>
-          <w:sz w:val="24"/>
-        </w:rPr>
-        <w:t xml:space="preserve"> </w:t>
-      </w:r>
-      <w:r>
-        <w:rPr>
-          <w:sz w:val="24"/>
-        </w:rPr>
-        <w:t>Generation,</w:t>
-      </w:r>
-      <w:r>
-        <w:rPr>
-          <w:spacing w:val="-15"/>
-          <w:sz w:val="24"/>
-        </w:rPr>
-        <w:t xml:space="preserve"> </w:t>
-      </w:r>
-      <w:r>
-        <w:rPr>
-          <w:sz w:val="24"/>
-        </w:rPr>
-        <w:t>and</w:t>
-      </w:r>
-      <w:r>
-        <w:rPr>
-          <w:spacing w:val="-15"/>
-          <w:sz w:val="24"/>
-        </w:rPr>
-        <w:t xml:space="preserve"> </w:t>
-      </w:r>
-      <w:r>
-        <w:rPr>
-          <w:sz w:val="24"/>
-        </w:rPr>
-        <w:t>Student Retention Analytics based on the ISO/IEC 9126 software quality standard in terms of:</w:t>
+      <w:r>
+        <w:rPr>
+          <w:sz w:val="24"/>
+        </w:rPr>
+        <w:t>AGORA - Agent Generator and OCR-based Recognition Assistant for Quiz Automation, AI-Assisted Learning Plan Generation, and Student Retention Analytics</w:t>
+      </w:r>
+      <w:r>
+        <w:rPr>
+          <w:sz w:val="24"/>
+        </w:rPr>
+        <w:t>based on the ISO/IEC 9126 software quality standard in terms of:</w:t>
       </w:r>
     </w:p>
     <w:p>
@@ -7410,45 +7013,17 @@
         </w:rPr>
         <w:t xml:space="preserve"> </w:t>
       </w:r>
-      <w:proofErr w:type="spellStart"/>
-      <w:r>
-        <w:rPr>
-          <w:sz w:val="24"/>
-        </w:rPr>
-        <w:t>ACTSight</w:t>
-      </w:r>
-      <w:proofErr w:type="spellEnd"/>
-      <w:r>
-        <w:rPr>
-          <w:sz w:val="24"/>
-        </w:rPr>
-        <w:t>:</w:t>
-      </w:r>
-      <w:r>
-        <w:rPr>
-          <w:spacing w:val="-15"/>
-          <w:sz w:val="24"/>
-        </w:rPr>
-        <w:t xml:space="preserve"> </w:t>
-      </w:r>
-      <w:r>
-        <w:rPr>
-          <w:sz w:val="24"/>
-        </w:rPr>
-        <w:t>An</w:t>
-      </w:r>
-      <w:r>
-        <w:rPr>
-          <w:spacing w:val="-15"/>
-          <w:sz w:val="24"/>
-        </w:rPr>
-        <w:t xml:space="preserve"> </w:t>
-      </w:r>
-      <w:r>
-        <w:rPr>
-          <w:sz w:val="24"/>
-        </w:rPr>
-        <w:t>OCR-Based Automated Assessment and Agentic Console for Quiz Automation, AI-Assisted Learning Plan Generation, and Student Retention Analytics at ACTS Computer College?</w:t>
+      <w:r>
+        <w:rPr>
+          <w:sz w:val="24"/>
+        </w:rPr>
+        <w:t>AGORA - Agent Generator and OCR-based Recognition Assistant for Quiz Automation, AI-Assisted Learning Plan Generation, and Student Retention Analytics</w:t>
+      </w:r>
+      <w:r>
+        <w:rPr>
+          <w:sz w:val="24"/>
+        </w:rPr>
+        <w:t>at ACTS Computer College?</w:t>
       </w:r>
     </w:p>
     <w:p>
@@ -7922,11 +7497,9 @@
         </w:rPr>
         <w:t xml:space="preserve"> </w:t>
       </w:r>
-      <w:proofErr w:type="spellStart"/>
-      <w:r>
-        <w:t>ACTSight</w:t>
-      </w:r>
-      <w:proofErr w:type="spellEnd"/>
+      <w:r>
+        <w:t>AGORA</w:t>
+      </w:r>
       <w:r>
         <w:rPr>
           <w:spacing w:val="-13"/>
@@ -8397,13 +7970,8 @@
         <w:t xml:space="preserve"> </w:t>
       </w:r>
       <w:r>
-        <w:t>E-</w:t>
-      </w:r>
-      <w:proofErr w:type="spellStart"/>
-      <w:r>
-        <w:t>Classrecord</w:t>
-      </w:r>
-      <w:proofErr w:type="spellEnd"/>
+        <w:t>E-Classrecord</w:t>
+      </w:r>
       <w:r>
         <w:rPr>
           <w:spacing w:val="-12"/>
@@ -9302,11 +8870,9 @@
       <w:r>
         <w:t xml:space="preserve">and performance-based retention analytics within a single educational system. Because </w:t>
       </w:r>
-      <w:proofErr w:type="spellStart"/>
-      <w:r>
-        <w:t>ACTSight</w:t>
-      </w:r>
-      <w:proofErr w:type="spellEnd"/>
+      <w:r>
+        <w:t>AGORA</w:t>
+      </w:r>
       <w:r>
         <w:t xml:space="preserve"> is proposed as a generalizable system blueprint rather than an application built exclusively for one institution, it may also provide a starting point for future studies that adapt similar functions to different institutional requirements, such as differing grading systems, academic calendars, or assessment formats.</w:t>
       </w:r>
@@ -9591,11 +9157,9 @@
         </w:rPr>
         <w:t xml:space="preserve"> </w:t>
       </w:r>
-      <w:proofErr w:type="spellStart"/>
-      <w:r>
-        <w:t>ACTSight</w:t>
-      </w:r>
-      <w:proofErr w:type="spellEnd"/>
+      <w:r>
+        <w:t>AGORA</w:t>
+      </w:r>
       <w:r>
         <w:rPr>
           <w:spacing w:val="-15"/>
@@ -9738,11 +9302,9 @@
         </w:rPr>
         <w:t xml:space="preserve"> </w:t>
       </w:r>
-      <w:proofErr w:type="spellStart"/>
-      <w:r>
-        <w:t>ACTSight</w:t>
-      </w:r>
-      <w:proofErr w:type="spellEnd"/>
+      <w:r>
+        <w:t>AGORA</w:t>
+      </w:r>
       <w:r>
         <w:t>,</w:t>
       </w:r>
@@ -10492,15 +10054,7 @@
         <w:t xml:space="preserve"> </w:t>
       </w:r>
       <w:r>
-        <w:t>system records the results, computes grades according to the teacher's defined assessment weights and criteria, and organizes them within a pre-formatted, landscape-oriented Excel-based E-</w:t>
-      </w:r>
-      <w:proofErr w:type="spellStart"/>
-      <w:r>
-        <w:t>Classrecord</w:t>
-      </w:r>
-      <w:proofErr w:type="spellEnd"/>
-      <w:r>
-        <w:t>. The Retention Analytics component uses Attendance (AT) and Assessment Score (AS) as indicators to classify students into the system-defined categories of At Risk, For Counseling, and Safe.</w:t>
+        <w:t>system records the results, computes grades according to the teacher's defined assessment weights and criteria, and organizes them within a pre-formatted, landscape-oriented Excel-based E-Classrecord. The Retention Analytics component uses Attendance (AT) and Assessment Score (AS) as indicators to classify students into the system-defined categories of At Risk, For Counseling, and Safe.</w:t>
       </w:r>
     </w:p>
     <w:p>
@@ -10688,15 +10242,7 @@
         <w:t xml:space="preserve"> </w:t>
       </w:r>
       <w:r>
-        <w:t>E-</w:t>
-      </w:r>
-      <w:proofErr w:type="spellStart"/>
-      <w:r>
-        <w:t>Classrecord</w:t>
-      </w:r>
-      <w:proofErr w:type="spellEnd"/>
-      <w:r>
-        <w:t>,</w:t>
+        <w:t>E-Classrecord,</w:t>
       </w:r>
       <w:r>
         <w:rPr>
@@ -10745,11 +10291,9 @@
         <w:spacing w:line="480" w:lineRule="auto"/>
         <w:ind w:right="349" w:firstLine="720"/>
       </w:pPr>
-      <w:proofErr w:type="spellStart"/>
-      <w:r>
-        <w:t>ACTSight</w:t>
-      </w:r>
-      <w:proofErr w:type="spellEnd"/>
+      <w:r>
+        <w:t>AGORA</w:t>
+      </w:r>
       <w:r>
         <w:t xml:space="preserve"> is not intended to replace the teacher's final academic decisions. Where automated processing—such as OCR-based text extraction or automated scoring of written responses—produces</w:t>
       </w:r>
@@ -10986,15 +10530,7 @@
         <w:ind w:right="363" w:firstLine="720"/>
       </w:pPr>
       <w:r>
-        <w:t>The Retention Analytics component classifies students using only two indicators, namely Attendance (AT) and Assessment Score (AS). The resulting classifications—At Risk, For Counseling, and Safe—</w:t>
-      </w:r>
-      <w:proofErr w:type="spellStart"/>
-      <w:r>
-        <w:t>are</w:t>
-      </w:r>
-      <w:proofErr w:type="spellEnd"/>
-      <w:r>
-        <w:t xml:space="preserve"> system-defined analytical categories based solely on these two indicators and are not intended to serve as a complete assessment of a student's personal circumstances or as a definitive prediction of future behavior.</w:t>
+        <w:t>The Retention Analytics component classifies students using only two indicators, namely Attendance (AT) and Assessment Score (AS). The resulting classifications—At Risk, For Counseling, and Safe—are system-defined analytical categories based solely on these two indicators and are not intended to serve as a complete assessment of a student's personal circumstances or as a definitive prediction of future behavior.</w:t>
       </w:r>
     </w:p>
     <w:p>
@@ -11126,11 +10662,9 @@
       <w:r>
         <w:t xml:space="preserve">of the study, the requirements and workflows examined are grounded primarily in that institution's practices. While </w:t>
       </w:r>
-      <w:proofErr w:type="spellStart"/>
-      <w:r>
-        <w:t>ACTSight</w:t>
-      </w:r>
-      <w:proofErr w:type="spellEnd"/>
+      <w:r>
+        <w:t>AGORA</w:t>
+      </w:r>
       <w:r>
         <w:t xml:space="preserve"> is designed as an adaptable system blueprint, the extent to which its underlying assumptions apply to other educational institutions without modification is not established within the scope of this study.</w:t>
       </w:r>

</xml_diff>